<commit_message>
Regenerate rad.docx with title page; add make-docx.ps1 export script
The earlier export used `pandoc rad.md ...` (ticket 02's original command),
which dropped the naslovna.md title page. Regenerate correctly by prepending
naslovna.md and suppressing rad.md's own title block with -M title/-M author.

Wrap the correct invocation in tools/make-docx.ps1 as the single canonical way
to rebuild the Word doc, so the title page can't be lost by hand again. Note
the changed command in ticket 02 and point WORKFLOW.md's quick reference at the
script.

Co-Authored-By: Claude Opus 4.8 <noreply@anthropic.com>
</commit_message>
<xml_diff>
--- a/Tema 1. - Obrada upita (query processing) u MySQL/rad.docx
+++ b/Tema 1. - Obrada upita (query processing) u MySQL/rad.docx
@@ -4,18 +4,244 @@
   <w:body>
     <w:p>
       <w:pPr>
-        <w:pStyle w:val="Title"/>
-      </w:pPr>
-      <w:r>
-        <w:t xml:space="preserve">Obrada upita (Query Processing) u MySQL-u</w:t>
-      </w:r>
-    </w:p>
-    <w:p>
-      <w:pPr>
         <w:pStyle w:val="Author"/>
       </w:pPr>
-      <w:r>
-        <w:t xml:space="preserve">Petar Brajković</w:t>
+    </w:p>
+    <w:p>
+      <w:pPr>
+        <w:jc w:val="center"/>
+        <w:spacing w:before="0" w:after="0" w:line="240" w:lineRule="auto"/>
+      </w:pPr>
+      <w:r>
+        <w:rPr>
+          <w:rFonts w:ascii="Times New Roman" w:hAnsi="Times New Roman"/>
+          <w:sz w:val="28"/>
+          <w:szCs w:val="28"/>
+        </w:rPr>
+        <w:t>UNIVERZITET U NIŠU</w:t>
+      </w:r>
+    </w:p>
+    <w:p>
+      <w:pPr>
+        <w:jc w:val="center"/>
+        <w:spacing w:before="140" w:after="0" w:line="240" w:lineRule="auto"/>
+      </w:pPr>
+      <w:r>
+        <w:rPr>
+          <w:rFonts w:ascii="Times New Roman" w:hAnsi="Times New Roman"/>
+          <w:sz w:val="28"/>
+          <w:szCs w:val="28"/>
+        </w:rPr>
+        <w:t>ELEKTRONSKI FAKULTET</w:t>
+      </w:r>
+    </w:p>
+    <w:p>
+      <w:pPr>
+        <w:jc w:val="center"/>
+        <w:spacing w:before="3800" w:after="0" w:line="240" w:lineRule="auto"/>
+      </w:pPr>
+      <w:r>
+        <w:rPr>
+          <w:rFonts w:ascii="Times New Roman" w:hAnsi="Times New Roman"/>
+          <w:b/>
+          <w:sz w:val="28"/>
+          <w:szCs w:val="28"/>
+        </w:rPr>
+        <w:t xml:space="preserve">Obrada upita </w:t>
+      </w:r>
+      <w:r>
+        <w:rPr>
+          <w:rFonts w:ascii="Times New Roman" w:hAnsi="Times New Roman"/>
+          <w:b/>
+          <w:i/>
+          <w:sz w:val="28"/>
+          <w:szCs w:val="28"/>
+        </w:rPr>
+        <w:t>(Query Processing)</w:t>
+      </w:r>
+      <w:r>
+        <w:rPr>
+          <w:rFonts w:ascii="Times New Roman" w:hAnsi="Times New Roman"/>
+          <w:b/>
+          <w:sz w:val="28"/>
+          <w:szCs w:val="28"/>
+        </w:rPr>
+        <w:t xml:space="preserve"> u MySQL-u</w:t>
+      </w:r>
+    </w:p>
+    <w:p>
+      <w:pPr>
+        <w:jc w:val="center"/>
+        <w:spacing w:before="760" w:after="0" w:line="240" w:lineRule="auto"/>
+      </w:pPr>
+      <w:r>
+        <w:rPr>
+          <w:rFonts w:ascii="Times New Roman" w:hAnsi="Times New Roman"/>
+          <w:sz w:val="24"/>
+          <w:szCs w:val="24"/>
+        </w:rPr>
+        <w:t>Seminarski rad</w:t>
+      </w:r>
+    </w:p>
+    <w:p>
+      <w:pPr>
+        <w:jc w:val="center"/>
+        <w:spacing w:before="120" w:after="0" w:line="240" w:lineRule="auto"/>
+      </w:pPr>
+      <w:r>
+        <w:rPr>
+          <w:rFonts w:ascii="Times New Roman" w:hAnsi="Times New Roman"/>
+          <w:sz w:val="24"/>
+          <w:szCs w:val="24"/>
+        </w:rPr>
+        <w:t>Predmet: Sistemi baza podataka</w:t>
+      </w:r>
+    </w:p>
+    <w:p>
+      <w:pPr>
+        <w:jc w:val="center"/>
+        <w:spacing w:before="120" w:after="0" w:line="240" w:lineRule="auto"/>
+      </w:pPr>
+      <w:r>
+        <w:rPr>
+          <w:rFonts w:ascii="Times New Roman" w:hAnsi="Times New Roman"/>
+          <w:sz w:val="24"/>
+          <w:szCs w:val="24"/>
+        </w:rPr>
+        <w:t>Studijski program: Elektrotehnika i računarstvo</w:t>
+      </w:r>
+    </w:p>
+    <w:p>
+      <w:pPr>
+        <w:jc w:val="center"/>
+        <w:spacing w:before="120" w:after="0" w:line="240" w:lineRule="auto"/>
+      </w:pPr>
+      <w:r>
+        <w:rPr>
+          <w:rFonts w:ascii="Times New Roman" w:hAnsi="Times New Roman"/>
+          <w:sz w:val="24"/>
+          <w:szCs w:val="24"/>
+        </w:rPr>
+        <w:t>Modul: Računarstvo i informatika</w:t>
+      </w:r>
+    </w:p>
+    <w:p>
+      <w:pPr>
+        <w:spacing w:before="2240" w:after="0" w:line="240" w:lineRule="auto"/>
+      </w:pPr>
+    </w:p>
+    <w:tbl>
+      <w:tblPr>
+        <w:tblW w:w="9360" w:type="dxa"/>
+        <w:jc w:val="center"/>
+        <w:tblBorders>
+          <w:top w:val="none" w:sz="0" w:space="0" w:color="auto"/>
+          <w:left w:val="none" w:sz="0" w:space="0" w:color="auto"/>
+          <w:bottom w:val="none" w:sz="0" w:space="0" w:color="auto"/>
+          <w:right w:val="none" w:sz="0" w:space="0" w:color="auto"/>
+          <w:insideH w:val="none" w:sz="0" w:space="0" w:color="auto"/>
+          <w:insideV w:val="none" w:sz="0" w:space="0" w:color="auto"/>
+        </w:tblBorders>
+        <w:tblLayout w:type="fixed"/>
+      </w:tblPr>
+      <w:tblGrid>
+        <w:gridCol w:w="4680"/>
+        <w:gridCol w:w="4680"/>
+      </w:tblGrid>
+      <w:tr>
+        <w:tc>
+          <w:tcPr>
+            <w:tcW w:w="4680" w:type="dxa"/>
+          </w:tcPr>
+          <w:p>
+            <w:pPr>
+              <w:spacing w:before="0" w:after="0" w:line="240" w:lineRule="auto"/>
+            </w:pPr>
+            <w:r>
+              <w:rPr>
+                <w:rFonts w:ascii="Times New Roman" w:hAnsi="Times New Roman"/>
+                <w:sz w:val="24"/>
+                <w:szCs w:val="24"/>
+              </w:rPr>
+              <w:t>Student:</w:t>
+            </w:r>
+          </w:p>
+        </w:tc>
+        <w:tc>
+          <w:tcPr>
+            <w:tcW w:w="4680" w:type="dxa"/>
+          </w:tcPr>
+          <w:p>
+            <w:pPr>
+              <w:spacing w:before="0" w:after="0" w:line="240" w:lineRule="auto"/>
+            </w:pPr>
+            <w:r>
+              <w:rPr>
+                <w:rFonts w:ascii="Times New Roman" w:hAnsi="Times New Roman"/>
+                <w:sz w:val="24"/>
+                <w:szCs w:val="24"/>
+              </w:rPr>
+              <w:t>Mentor:</w:t>
+            </w:r>
+          </w:p>
+        </w:tc>
+      </w:tr>
+      <w:tr>
+        <w:tc>
+          <w:tcPr>
+            <w:tcW w:w="4680" w:type="dxa"/>
+          </w:tcPr>
+          <w:p>
+            <w:pPr>
+              <w:spacing w:before="180" w:after="0" w:line="240" w:lineRule="auto"/>
+            </w:pPr>
+            <w:r>
+              <w:rPr>
+                <w:rFonts w:ascii="Times New Roman" w:hAnsi="Times New Roman"/>
+                <w:sz w:val="24"/>
+                <w:szCs w:val="24"/>
+              </w:rPr>
+              <w:t>Petar Brajković, br. ind. 16494</w:t>
+            </w:r>
+          </w:p>
+        </w:tc>
+        <w:tc>
+          <w:tcPr>
+            <w:tcW w:w="4680" w:type="dxa"/>
+          </w:tcPr>
+          <w:p>
+            <w:pPr>
+              <w:spacing w:before="180" w:after="0" w:line="240" w:lineRule="auto"/>
+            </w:pPr>
+            <w:r>
+              <w:rPr>
+                <w:rFonts w:ascii="Times New Roman" w:hAnsi="Times New Roman"/>
+                <w:sz w:val="24"/>
+                <w:szCs w:val="24"/>
+              </w:rPr>
+              <w:t>Prof. dr Aleksandar Stanimirović</w:t>
+            </w:r>
+          </w:p>
+        </w:tc>
+      </w:tr>
+    </w:tbl>
+    <w:p>
+      <w:pPr>
+        <w:jc w:val="center"/>
+        <w:spacing w:before="1600" w:after="0" w:line="240" w:lineRule="auto"/>
+      </w:pPr>
+      <w:r>
+        <w:rPr>
+          <w:rFonts w:ascii="Times New Roman" w:hAnsi="Times New Roman"/>
+          <w:sz w:val="24"/>
+          <w:szCs w:val="24"/>
+        </w:rPr>
+        <w:t>Niš, 2026. godina</w:t>
+      </w:r>
+    </w:p>
+    <w:p>
+      <w:r>
+        <w:br w:type="page"/>
       </w:r>
     </w:p>
     <w:bookmarkStart w:id="12" w:name="uvod"/>

</xml_diff>

<commit_message>
Stop citing university lecture material; re-home chapter 1 citations
Per the user's decision, the provided university decks/PDFs (Stoimenov SUBP
slides) are learning material only and are never cited in the paper. Drop the
two @stoimenov_* references.bib entries and re-cite chapter 1's deck-backed
claims to their published origin: Ramakrishnan & Gehrke for the theory, the
MySQL 8.4 manual for MySQL-specifics. References now render as IEEE [1]-[2];
rad.docx regenerated.

Record the sourcing policy so future chapters follow it: WORKFLOW.md rule 7,
RESOURCES.md and GLOSSARY.md notes, and a standing preference on the map.

Co-Authored-By: Claude Opus 4.8 <noreply@anthropic.com>
</commit_message>
<xml_diff>
--- a/Tema 1. - Obrada upita (query processing) u MySQL/rad.docx
+++ b/Tema 1. - Obrada upita (query processing) u MySQL/rad.docx
@@ -326,7 +326,7 @@
         <w:t xml:space="preserve"> </w:t>
       </w:r>
       <w:r>
-        <w:t xml:space="preserve">[1], [2]</w:t>
+        <w:t xml:space="preserve">[1]</w:t>
       </w:r>
       <w:r>
         <w:t xml:space="preserve">.</w:t>
@@ -337,16 +337,7 @@
         <w:pStyle w:val="BodyText"/>
       </w:pPr>
       <w:r>
-        <w:t xml:space="preserve">Jaz se premošćuje optimizacijom na dva nivoa jednog istog problema</w:t>
-      </w:r>
-      <w:r>
-        <w:t xml:space="preserve"> </w:t>
-      </w:r>
-      <w:r>
-        <w:t xml:space="preserve">[1]</w:t>
-      </w:r>
-      <w:r>
-        <w:t xml:space="preserve">. Na</w:t>
+        <w:t xml:space="preserve">Jaz se premošćuje optimizacijom na dva nivoa jednog istog problema. Na</w:t>
       </w:r>
       <w:r>
         <w:t xml:space="preserve"> </w:t>
@@ -392,84 +383,75 @@
         <w:t xml:space="preserve"> </w:t>
       </w:r>
       <w:r>
-        <w:t xml:space="preserve">najpovoljniji izbor zavisi od svojstava samih podataka</w:t>
+        <w:t xml:space="preserve">najpovoljniji izbor zavisi od svojstava samih podataka. Oba nivoa vođena su</w:t>
+      </w:r>
+      <w:r>
+        <w:t xml:space="preserve"> </w:t>
+      </w:r>
+      <w:r>
+        <w:t xml:space="preserve">istim merilom — cenom, procenom količine posla, pre svega ulazno-izlaznih operacija — i taj</w:t>
+      </w:r>
+      <w:r>
+        <w:t xml:space="preserve"> </w:t>
+      </w:r>
+      <w:r>
+        <w:t xml:space="preserve">zajednički cilj čini ih dvama nivoima jednog problema, a ne dvama odvojenim problemima</w:t>
+      </w:r>
+      <w:r>
+        <w:t xml:space="preserve"> </w:t>
+      </w:r>
+      <w:r>
+        <w:t xml:space="preserve">[1]</w:t>
+      </w:r>
+      <w:r>
+        <w:t xml:space="preserve">.</w:t>
+      </w:r>
+    </w:p>
+    <w:p>
+      <w:pPr>
+        <w:pStyle w:val="BodyText"/>
+      </w:pPr>
+      <w:r>
+        <w:t xml:space="preserve">Kombinovanjem logičkih i fizičkih izbora jedan nepromenjen SQL upit grana se na više planova</w:t>
+      </w:r>
+      <w:r>
+        <w:t xml:space="preserve"> </w:t>
+      </w:r>
+      <w:r>
+        <w:t xml:space="preserve">izvršenja koji vraćaju identičan rezultat, ali čija se cena razlikuje za nekoliko redova veličine:</w:t>
+      </w:r>
+      <w:r>
+        <w:t xml:space="preserve"> </w:t>
+      </w:r>
+      <w:r>
+        <w:t xml:space="preserve">selektivan indeks dodirne šačicu stranica, dok sken cele tabele pročita milione redova. Zadatak</w:t>
+      </w:r>
+      <w:r>
+        <w:t xml:space="preserve"> </w:t>
+      </w:r>
+      <w:r>
+        <w:t xml:space="preserve">SUBP-a jeste da među tim ekvivalentnim planovima pronađe i izabere najefikasniji</w:t>
+      </w:r>
+      <w:r>
+        <w:t xml:space="preserve"> </w:t>
+      </w:r>
+      <w:r>
+        <w:t xml:space="preserve">[1]</w:t>
+      </w:r>
+      <w:r>
+        <w:t xml:space="preserve">. MySQL taj izbor poverava optimizatoru upita zasnovanom na ceni</w:t>
+      </w:r>
+      <w:r>
+        <w:t xml:space="preserve"> </w:t>
+      </w:r>
+      <w:r>
+        <w:t xml:space="preserve">(cost-based optimizer), koji procenjuje cenu razmatranih planova i zadržava najjeftiniji</w:t>
       </w:r>
       <w:r>
         <w:t xml:space="preserve"> </w:t>
       </w:r>
       <w:r>
         <w:t xml:space="preserve">[2]</w:t>
-      </w:r>
-      <w:r>
-        <w:t xml:space="preserve">. Oba nivoa vođena su</w:t>
-      </w:r>
-      <w:r>
-        <w:t xml:space="preserve"> </w:t>
-      </w:r>
-      <w:r>
-        <w:t xml:space="preserve">istim merilom — cenom, procenom količine posla, pre svega ulazno-izlaznih operacija — i taj</w:t>
-      </w:r>
-      <w:r>
-        <w:t xml:space="preserve"> </w:t>
-      </w:r>
-      <w:r>
-        <w:t xml:space="preserve">zajednički cilj čini ih dvama nivoima jednog problema, a ne dvama odvojenim problemima</w:t>
-      </w:r>
-      <w:r>
-        <w:t xml:space="preserve"> </w:t>
-      </w:r>
-      <w:r>
-        <w:t xml:space="preserve">[1], [3]</w:t>
-      </w:r>
-      <w:r>
-        <w:t xml:space="preserve">.</w:t>
-      </w:r>
-    </w:p>
-    <w:p>
-      <w:pPr>
-        <w:pStyle w:val="BodyText"/>
-      </w:pPr>
-      <w:r>
-        <w:t xml:space="preserve">Kombinovanjem logičkih i fizičkih izbora jedan nepromenjen SQL upit grana se na više planova</w:t>
-      </w:r>
-      <w:r>
-        <w:t xml:space="preserve"> </w:t>
-      </w:r>
-      <w:r>
-        <w:t xml:space="preserve">izvršenja koji vraćaju identičan rezultat, ali čija se cena razlikuje za nekoliko redova veličine:</w:t>
-      </w:r>
-      <w:r>
-        <w:t xml:space="preserve"> </w:t>
-      </w:r>
-      <w:r>
-        <w:t xml:space="preserve">selektivan indeks dodirne šačicu stranica, dok sken cele tabele pročita milione redova. Zadatak</w:t>
-      </w:r>
-      <w:r>
-        <w:t xml:space="preserve"> </w:t>
-      </w:r>
-      <w:r>
-        <w:t xml:space="preserve">SUBP-a jeste da među tim ekvivalentnim planovima pronađe i izabere najefikasniji</w:t>
-      </w:r>
-      <w:r>
-        <w:t xml:space="preserve"> </w:t>
-      </w:r>
-      <w:r>
-        <w:t xml:space="preserve">[1]</w:t>
-      </w:r>
-      <w:r>
-        <w:t xml:space="preserve">. MySQL taj izbor poverava optimizatoru upita zasnovanom na ceni</w:t>
-      </w:r>
-      <w:r>
-        <w:t xml:space="preserve"> </w:t>
-      </w:r>
-      <w:r>
-        <w:t xml:space="preserve">(cost-based optimizer), koji procenjuje cenu razmatranih planova i zadržava najjeftiniji</w:t>
-      </w:r>
-      <w:r>
-        <w:t xml:space="preserve"> </w:t>
-      </w:r>
-      <w:r>
-        <w:t xml:space="preserve">[4]</w:t>
       </w:r>
       <w:r>
         <w:t xml:space="preserve">.</w:t>
@@ -990,7 +972,7 @@
       </w:r>
     </w:p>
     <w:bookmarkEnd w:id="20"/>
-    <w:bookmarkStart w:id="27" w:name="reference"/>
+    <w:bookmarkStart w:id="25" w:name="reference"/>
     <w:p>
       <w:pPr>
         <w:pStyle w:val="Heading1"/>
@@ -999,76 +981,14 @@
         <w:t xml:space="preserve">Reference</w:t>
       </w:r>
     </w:p>
-    <w:bookmarkStart w:id="26" w:name="refs"/>
-    <w:bookmarkStart w:id="21" w:name="ref-stoimenov_optimizacija"/>
+    <w:bookmarkStart w:id="24" w:name="refs"/>
+    <w:bookmarkStart w:id="21" w:name="ref-ramakrishnan2003"/>
     <w:p>
       <w:pPr>
         <w:pStyle w:val="Bibliography"/>
       </w:pPr>
       <w:r>
         <w:t xml:space="preserve">[1]</w:t>
-      </w:r>
-      <w:r>
-        <w:t xml:space="preserve"> </w:t>
-      </w:r>
-      <w:r>
-        <w:t xml:space="preserve">	</w:t>
-      </w:r>
-      <w:r>
-        <w:t xml:space="preserve">L. Stoimenov,</w:t>
-      </w:r>
-      <w:r>
-        <w:t xml:space="preserve"> </w:t>
-      </w:r>
-      <w:r>
-        <w:t xml:space="preserve">“Optimizacija upita.”</w:t>
-      </w:r>
-      <w:r>
-        <w:t xml:space="preserve"> </w:t>
-      </w:r>
-      <w:r>
-        <w:t xml:space="preserve">predavanja iz predmeta Sistemi za upravljanje bazama podataka (SUBP), Elektronski fakultet, Univerzitet u Nišu, 2016.</w:t>
-      </w:r>
-    </w:p>
-    <w:bookmarkEnd w:id="21"/>
-    <w:bookmarkStart w:id="22" w:name="ref-stoimenov_evaluacija"/>
-    <w:p>
-      <w:pPr>
-        <w:pStyle w:val="Bibliography"/>
-      </w:pPr>
-      <w:r>
-        <w:t xml:space="preserve">[2]</w:t>
-      </w:r>
-      <w:r>
-        <w:t xml:space="preserve"> </w:t>
-      </w:r>
-      <w:r>
-        <w:t xml:space="preserve">	</w:t>
-      </w:r>
-      <w:r>
-        <w:t xml:space="preserve">L. Stoimenov,</w:t>
-      </w:r>
-      <w:r>
-        <w:t xml:space="preserve"> </w:t>
-      </w:r>
-      <w:r>
-        <w:t xml:space="preserve">“Evaluacija upita.”</w:t>
-      </w:r>
-      <w:r>
-        <w:t xml:space="preserve"> </w:t>
-      </w:r>
-      <w:r>
-        <w:t xml:space="preserve">predavanja iz predmeta Sistemi za upravljanje bazama podataka (SUBP), Elektronski fakultet, Univerzitet u Nišu, 2016.</w:t>
-      </w:r>
-    </w:p>
-    <w:bookmarkEnd w:id="22"/>
-    <w:bookmarkStart w:id="23" w:name="ref-ramakrishnan2003"/>
-    <w:p>
-      <w:pPr>
-        <w:pStyle w:val="Bibliography"/>
-      </w:pPr>
-      <w:r>
-        <w:t xml:space="preserve">[3]</w:t>
       </w:r>
       <w:r>
         <w:t xml:space="preserve"> </w:t>
@@ -1093,14 +1013,14 @@
         <w:t xml:space="preserve">, 3rd ed. New York, NY, USA: McGraw-Hill, 2003.</w:t>
       </w:r>
     </w:p>
-    <w:bookmarkEnd w:id="23"/>
-    <w:bookmarkStart w:id="25" w:name="ref-mysql84refman"/>
+    <w:bookmarkEnd w:id="21"/>
+    <w:bookmarkStart w:id="23" w:name="ref-mysql84refman"/>
     <w:p>
       <w:pPr>
         <w:pStyle w:val="Bibliography"/>
       </w:pPr>
       <w:r>
-        <w:t xml:space="preserve">[4]</w:t>
+        <w:t xml:space="preserve">[2]</w:t>
       </w:r>
       <w:r>
         <w:t xml:space="preserve"> </w:t>
@@ -1129,7 +1049,7 @@
       <w:r>
         <w:t xml:space="preserve"> </w:t>
       </w:r>
-      <w:hyperlink r:id="rId24">
+      <w:hyperlink r:id="rId22">
         <w:r>
           <w:rPr>
             <w:rStyle w:val="Hyperlink"/>
@@ -1141,9 +1061,9 @@
         <w:t xml:space="preserve">, 2024.</w:t>
       </w:r>
     </w:p>
+    <w:bookmarkEnd w:id="23"/>
+    <w:bookmarkEnd w:id="24"/>
     <w:bookmarkEnd w:id="25"/>
-    <w:bookmarkEnd w:id="26"/>
-    <w:bookmarkEnd w:id="27"/>
     <w:sectPr>
       <w:footnotePr>
         <w:numRestart w:val="eachSect"/>

</xml_diff>

<commit_message>
Style the DOCX export: justified body, centered figures/captions, SQL highlighting
Add a pandoc reference document (assets/reference-paper.docx, built reproducibly
by tools/build-reference-doc.py) and wire it into make-docx.ps1:

- Body text justified (w:jc both on Normal; BodyText/FirstParagraph inherit it).
- Figures and their captions centered (Figure/CaptionedFigure/ImageCaption).
- Front page deliberately untouched - naslovna.md is raw OpenXML with inline
  centering, which overrides the style.
- --syntax-highlighting=tango colors fenced ```sql blocks; inline SQL already
  renders in Consolas via VerbatimChar.

Document the styling step in ticket 02.

Co-Authored-By: Claude Opus 4.8 <noreply@anthropic.com>
</commit_message>
<xml_diff>
--- a/Tema 1. - Obrada upita (query processing) u MySQL/rad.docx
+++ b/Tema 1. - Obrada upita (query processing) u MySQL/rad.docx
@@ -1307,6 +1307,9 @@
   <w:style w:default="1" w:styleId="Normal" w:type="paragraph">
     <w:name w:val="Normal"/>
     <w:qFormat/>
+    <w:pPr>
+      <w:jc w:val="both"/>
+    </w:pPr>
   </w:style>
   <w:style w:styleId="BodyText" w:type="paragraph">
     <w:name w:val="Body Text"/>
@@ -1881,16 +1884,23 @@
   <w:style w:customStyle="1" w:styleId="ImageCaption" w:type="paragraph">
     <w:name w:val="Image Caption"/>
     <w:basedOn w:val="Caption"/>
+    <w:pPr>
+      <w:jc w:val="center"/>
+    </w:pPr>
   </w:style>
   <w:style w:customStyle="1" w:styleId="Figure" w:type="paragraph">
     <w:name w:val="Figure"/>
     <w:basedOn w:val="Normal"/>
+    <w:pPr>
+      <w:jc w:val="center"/>
+    </w:pPr>
   </w:style>
   <w:style w:customStyle="1" w:styleId="CaptionedFigure" w:type="paragraph">
     <w:name w:val="Captioned Figure"/>
     <w:basedOn w:val="Figure"/>
     <w:pPr>
       <w:keepNext/>
+      <w:jc w:val="center"/>
     </w:pPr>
   </w:style>
   <w:style w:customStyle="1" w:styleId="BodyTextChar" w:type="character">
@@ -1948,6 +1958,7 @@
     <w:link w:val="VerbatimChar"/>
     <w:pPr>
       <w:wordWrap w:val="off"/>
+      <w:shd w:val="clear" w:fill="f8f8f8"/>
     </w:pPr>
   </w:style>
   <w:style w:type="character" w:customStyle="1" w:styleId="KeywordTok">
@@ -1955,85 +1966,96 @@
     <w:basedOn w:val="VerbatimChar"/>
     <w:rPr>
       <w:b/>
-      <w:color w:val="007020"/>
+      <w:color w:val="204a87"/>
+      <w:shd w:val="clear" w:fill="f8f8f8"/>
     </w:rPr>
   </w:style>
   <w:style w:type="character" w:customStyle="1" w:styleId="DataTypeTok">
     <w:name w:val="DataTypeTok"/>
     <w:basedOn w:val="VerbatimChar"/>
     <w:rPr>
-      <w:color w:val="902000"/>
+      <w:color w:val="204a87"/>
+      <w:shd w:val="clear" w:fill="f8f8f8"/>
     </w:rPr>
   </w:style>
   <w:style w:type="character" w:customStyle="1" w:styleId="DecValTok">
     <w:name w:val="DecValTok"/>
     <w:basedOn w:val="VerbatimChar"/>
     <w:rPr>
-      <w:color w:val="40a070"/>
+      <w:color w:val="0000cf"/>
+      <w:shd w:val="clear" w:fill="f8f8f8"/>
     </w:rPr>
   </w:style>
   <w:style w:type="character" w:customStyle="1" w:styleId="BaseNTok">
     <w:name w:val="BaseNTok"/>
     <w:basedOn w:val="VerbatimChar"/>
     <w:rPr>
-      <w:color w:val="40a070"/>
+      <w:color w:val="0000cf"/>
+      <w:shd w:val="clear" w:fill="f8f8f8"/>
     </w:rPr>
   </w:style>
   <w:style w:type="character" w:customStyle="1" w:styleId="FloatTok">
     <w:name w:val="FloatTok"/>
     <w:basedOn w:val="VerbatimChar"/>
     <w:rPr>
-      <w:color w:val="40a070"/>
+      <w:color w:val="0000cf"/>
+      <w:shd w:val="clear" w:fill="f8f8f8"/>
     </w:rPr>
   </w:style>
   <w:style w:type="character" w:customStyle="1" w:styleId="ConstantTok">
     <w:name w:val="ConstantTok"/>
     <w:basedOn w:val="VerbatimChar"/>
     <w:rPr>
-      <w:color w:val="880000"/>
+      <w:color w:val="8f5902"/>
+      <w:shd w:val="clear" w:fill="f8f8f8"/>
     </w:rPr>
   </w:style>
   <w:style w:type="character" w:customStyle="1" w:styleId="CharTok">
     <w:name w:val="CharTok"/>
     <w:basedOn w:val="VerbatimChar"/>
     <w:rPr>
-      <w:color w:val="4070a0"/>
+      <w:color w:val="4e9a06"/>
+      <w:shd w:val="clear" w:fill="f8f8f8"/>
     </w:rPr>
   </w:style>
   <w:style w:type="character" w:customStyle="1" w:styleId="SpecialCharTok">
     <w:name w:val="SpecialCharTok"/>
     <w:basedOn w:val="VerbatimChar"/>
     <w:rPr>
-      <w:color w:val="4070a0"/>
+      <w:b/>
+      <w:color w:val="ce5c00"/>
+      <w:shd w:val="clear" w:fill="f8f8f8"/>
     </w:rPr>
   </w:style>
   <w:style w:type="character" w:customStyle="1" w:styleId="StringTok">
     <w:name w:val="StringTok"/>
     <w:basedOn w:val="VerbatimChar"/>
     <w:rPr>
-      <w:color w:val="4070a0"/>
+      <w:color w:val="4e9a06"/>
+      <w:shd w:val="clear" w:fill="f8f8f8"/>
     </w:rPr>
   </w:style>
   <w:style w:type="character" w:customStyle="1" w:styleId="VerbatimStringTok">
     <w:name w:val="VerbatimStringTok"/>
     <w:basedOn w:val="VerbatimChar"/>
     <w:rPr>
-      <w:color w:val="4070a0"/>
+      <w:color w:val="4e9a06"/>
+      <w:shd w:val="clear" w:fill="f8f8f8"/>
     </w:rPr>
   </w:style>
   <w:style w:type="character" w:customStyle="1" w:styleId="SpecialStringTok">
     <w:name w:val="SpecialStringTok"/>
     <w:basedOn w:val="VerbatimChar"/>
     <w:rPr>
-      <w:color w:val="bb6688"/>
+      <w:color w:val="4e9a06"/>
+      <w:shd w:val="clear" w:fill="f8f8f8"/>
     </w:rPr>
   </w:style>
   <w:style w:type="character" w:customStyle="1" w:styleId="ImportTok">
     <w:name w:val="ImportTok"/>
     <w:basedOn w:val="VerbatimChar"/>
     <w:rPr>
-      <w:b/>
-      <w:color w:val="008000"/>
+      <w:shd w:val="clear" w:fill="f8f8f8"/>
     </w:rPr>
   </w:style>
   <w:style w:type="character" w:customStyle="1" w:styleId="CommentTok">
@@ -2041,15 +2063,18 @@
     <w:basedOn w:val="VerbatimChar"/>
     <w:rPr>
       <w:i/>
-      <w:color w:val="60a0b0"/>
+      <w:color w:val="8f5902"/>
+      <w:shd w:val="clear" w:fill="f8f8f8"/>
     </w:rPr>
   </w:style>
   <w:style w:type="character" w:customStyle="1" w:styleId="DocumentationTok">
     <w:name w:val="DocumentationTok"/>
     <w:basedOn w:val="VerbatimChar"/>
     <w:rPr>
+      <w:b/>
       <w:i/>
-      <w:color w:val="ba2121"/>
+      <w:color w:val="8f5902"/>
+      <w:shd w:val="clear" w:fill="f8f8f8"/>
     </w:rPr>
   </w:style>
   <w:style w:type="character" w:customStyle="1" w:styleId="AnnotationTok">
@@ -2058,7 +2083,8 @@
     <w:rPr>
       <w:b/>
       <w:i/>
-      <w:color w:val="60a0b0"/>
+      <w:color w:val="8f5902"/>
+      <w:shd w:val="clear" w:fill="f8f8f8"/>
     </w:rPr>
   </w:style>
   <w:style w:type="character" w:customStyle="1" w:styleId="CommentVarTok">
@@ -2067,28 +2093,33 @@
     <w:rPr>
       <w:b/>
       <w:i/>
-      <w:color w:val="60a0b0"/>
+      <w:color w:val="8f5902"/>
+      <w:shd w:val="clear" w:fill="f8f8f8"/>
     </w:rPr>
   </w:style>
   <w:style w:type="character" w:customStyle="1" w:styleId="OtherTok">
     <w:name w:val="OtherTok"/>
     <w:basedOn w:val="VerbatimChar"/>
     <w:rPr>
-      <w:color w:val="007020"/>
+      <w:color w:val="8f5902"/>
+      <w:shd w:val="clear" w:fill="f8f8f8"/>
     </w:rPr>
   </w:style>
   <w:style w:type="character" w:customStyle="1" w:styleId="FunctionTok">
     <w:name w:val="FunctionTok"/>
     <w:basedOn w:val="VerbatimChar"/>
     <w:rPr>
-      <w:color w:val="06287e"/>
+      <w:b/>
+      <w:color w:val="204a87"/>
+      <w:shd w:val="clear" w:fill="f8f8f8"/>
     </w:rPr>
   </w:style>
   <w:style w:type="character" w:customStyle="1" w:styleId="VariableTok">
     <w:name w:val="VariableTok"/>
     <w:basedOn w:val="VerbatimChar"/>
     <w:rPr>
-      <w:color w:val="19177c"/>
+      <w:color w:val="000000"/>
+      <w:shd w:val="clear" w:fill="f8f8f8"/>
     </w:rPr>
   </w:style>
   <w:style w:type="character" w:customStyle="1" w:styleId="ControlFlowTok">
@@ -2096,46 +2127,56 @@
     <w:basedOn w:val="VerbatimChar"/>
     <w:rPr>
       <w:b/>
-      <w:color w:val="007020"/>
+      <w:color w:val="204a87"/>
+      <w:shd w:val="clear" w:fill="f8f8f8"/>
     </w:rPr>
   </w:style>
   <w:style w:type="character" w:customStyle="1" w:styleId="OperatorTok">
     <w:name w:val="OperatorTok"/>
     <w:basedOn w:val="VerbatimChar"/>
     <w:rPr>
-      <w:color w:val="666666"/>
+      <w:b/>
+      <w:color w:val="ce5c00"/>
+      <w:shd w:val="clear" w:fill="f8f8f8"/>
     </w:rPr>
   </w:style>
   <w:style w:type="character" w:customStyle="1" w:styleId="BuiltInTok">
     <w:name w:val="BuiltInTok"/>
     <w:basedOn w:val="VerbatimChar"/>
     <w:rPr>
-      <w:color w:val="008000"/>
+      <w:shd w:val="clear" w:fill="f8f8f8"/>
     </w:rPr>
   </w:style>
   <w:style w:type="character" w:customStyle="1" w:styleId="ExtensionTok">
     <w:name w:val="ExtensionTok"/>
     <w:basedOn w:val="VerbatimChar"/>
-    <w:rPr/>
+    <w:rPr>
+      <w:shd w:val="clear" w:fill="f8f8f8"/>
+    </w:rPr>
   </w:style>
   <w:style w:type="character" w:customStyle="1" w:styleId="PreprocessorTok">
     <w:name w:val="PreprocessorTok"/>
     <w:basedOn w:val="VerbatimChar"/>
     <w:rPr>
-      <w:color w:val="bc7a00"/>
+      <w:i/>
+      <w:color w:val="8f5902"/>
+      <w:shd w:val="clear" w:fill="f8f8f8"/>
     </w:rPr>
   </w:style>
   <w:style w:type="character" w:customStyle="1" w:styleId="AttributeTok">
     <w:name w:val="AttributeTok"/>
     <w:basedOn w:val="VerbatimChar"/>
     <w:rPr>
-      <w:color w:val="7d9029"/>
+      <w:color w:val="204a87"/>
+      <w:shd w:val="clear" w:fill="f8f8f8"/>
     </w:rPr>
   </w:style>
   <w:style w:type="character" w:customStyle="1" w:styleId="RegionMarkerTok">
     <w:name w:val="RegionMarkerTok"/>
     <w:basedOn w:val="VerbatimChar"/>
-    <w:rPr/>
+    <w:rPr>
+      <w:shd w:val="clear" w:fill="f8f8f8"/>
+    </w:rPr>
   </w:style>
   <w:style w:type="character" w:customStyle="1" w:styleId="InformationTok">
     <w:name w:val="InformationTok"/>
@@ -2143,7 +2184,8 @@
     <w:rPr>
       <w:b/>
       <w:i/>
-      <w:color w:val="60a0b0"/>
+      <w:color w:val="8f5902"/>
+      <w:shd w:val="clear" w:fill="f8f8f8"/>
     </w:rPr>
   </w:style>
   <w:style w:type="character" w:customStyle="1" w:styleId="WarningTok">
@@ -2152,15 +2194,16 @@
     <w:rPr>
       <w:b/>
       <w:i/>
-      <w:color w:val="60a0b0"/>
+      <w:color w:val="8f5902"/>
+      <w:shd w:val="clear" w:fill="f8f8f8"/>
     </w:rPr>
   </w:style>
   <w:style w:type="character" w:customStyle="1" w:styleId="AlertTok">
     <w:name w:val="AlertTok"/>
     <w:basedOn w:val="VerbatimChar"/>
     <w:rPr>
-      <w:b/>
-      <w:color w:val="ff0000"/>
+      <w:color w:val="ef2929"/>
+      <w:shd w:val="clear" w:fill="f8f8f8"/>
     </w:rPr>
   </w:style>
   <w:style w:type="character" w:customStyle="1" w:styleId="ErrorTok">
@@ -2168,13 +2211,16 @@
     <w:basedOn w:val="VerbatimChar"/>
     <w:rPr>
       <w:b/>
-      <w:color w:val="ff0000"/>
+      <w:color w:val="a40000"/>
+      <w:shd w:val="clear" w:fill="f8f8f8"/>
     </w:rPr>
   </w:style>
   <w:style w:type="character" w:customStyle="1" w:styleId="NormalTok">
     <w:name w:val="NormalTok"/>
     <w:basedOn w:val="VerbatimChar"/>
-    <w:rPr/>
+    <w:rPr>
+      <w:shd w:val="clear" w:fill="f8f8f8"/>
+    </w:rPr>
   </w:style>
 </w:styles>
 </file>

</xml_diff>

<commit_message>
Remove all em dashes from chapter 1 and its figure
Per the user's preference, no em dashes (—) anywhere. Rewrite the seven em
dashes in rad.md's Uvod as colons/commas/parentheses, and replace the three
&mdash; entities in the lesson-01 comparison figure, regenerating the PNG
(costs unchanged: index ~499373 vs table scan ~575645). Regenerate rad.docx.

Record the rule in WORKFLOW.md (rule 8); the academic-research-writer skill
itself was updated separately (it lives outside this repo).

Co-Authored-By: Claude Opus 4.8 <noreply@anthropic.com>
</commit_message>
<xml_diff>
--- a/Tema 1. - Obrada upita (query processing) u MySQL/rad.docx
+++ b/Tema 1. - Obrada upita (query processing) u MySQL/rad.docx
@@ -302,7 +302,7 @@
         <w:t xml:space="preserve"> </w:t>
       </w:r>
       <w:r>
-        <w:t xml:space="preserve">(SUBP), s druge strane, ume da izvrši isključivo konkretne fizičke procedure — čitanje i upisivanje</w:t>
+        <w:t xml:space="preserve">(SUBP), s druge strane, ume da izvrši isključivo konkretne fizičke procedure: čitanje i upisivanje</w:t>
       </w:r>
       <w:r>
         <w:t xml:space="preserve"> </w:t>
@@ -371,7 +371,7 @@
         <w:t xml:space="preserve"> </w:t>
       </w:r>
       <w:r>
-        <w:t xml:space="preserve">konkretan algoritam i pristupni put — sken tabele naspram skena preko indeksa, odnosno spoj sa</w:t>
+        <w:t xml:space="preserve">konkretan algoritam i pristupni put: sken tabele naspram skena preko indeksa, odnosno spoj sa</w:t>
       </w:r>
       <w:r>
         <w:t xml:space="preserve"> </w:t>
@@ -389,7 +389,7 @@
         <w:t xml:space="preserve"> </w:t>
       </w:r>
       <w:r>
-        <w:t xml:space="preserve">istim merilom — cenom, procenom količine posla, pre svega ulazno-izlaznih operacija — i taj</w:t>
+        <w:t xml:space="preserve">istim merilom, cenom (procenom količine posla, pre svega ulazno-izlaznih operacija), i taj</w:t>
       </w:r>
       <w:r>
         <w:t xml:space="preserve"> </w:t>
@@ -589,7 +589,7 @@
         <w:t xml:space="preserve">idx_country_code</w:t>
       </w:r>
       <w:r>
-        <w:t xml:space="preserve">, dok se zabranjivanjem tog indeksa dobija sken cele tabele — skuplji plan koji</w:t>
+        <w:t xml:space="preserve">, dok se zabranjivanjem tog indeksa dobija sken cele tabele, skuplji plan koji</w:t>
       </w:r>
       <w:r>
         <w:t xml:space="preserve"> </w:t>
@@ -609,7 +609,7 @@
         <w:pStyle w:val="BodyText"/>
       </w:pPr>
       <w:r>
-        <w:t xml:space="preserve">Ostatak rada prati istu nit — put od deklarativnog SQL upita do njegovog fizičkog izvršenja u</w:t>
+        <w:t xml:space="preserve">Ostatak rada prati istu nit, put od deklarativnog SQL upita do njegovog fizičkog izvršenja u</w:t>
       </w:r>
       <w:r>
         <w:t xml:space="preserve"> </w:t>
@@ -658,7 +658,7 @@
         </w:numPr>
       </w:pPr>
       <w:r>
-        <w:t xml:space="preserve">U poglavlju 3 dva nivoa optimizacije prikazuju se opipljivo — kao</w:t>
+        <w:t xml:space="preserve">U poglavlju 3 dva nivoa optimizacije prikazuju se opipljivo, kao</w:t>
       </w:r>
       <w:r>
         <w:t xml:space="preserve"> </w:t>
@@ -848,10 +848,7 @@
         <w:t xml:space="preserve">keširanje i ponovnu upotrebu planova</w:t>
       </w:r>
       <w:r>
-        <w:t xml:space="preserve"> </w:t>
-      </w:r>
-      <w:r>
-        <w:t xml:space="preserve">— pitanje može li se izabrani plan</w:t>
+        <w:t xml:space="preserve">: pitanje može li se izabrani plan</w:t>
       </w:r>
       <w:r>
         <w:t xml:space="preserve"> </w:t>

</xml_diff>

<commit_message>
Write chapter 2 (Arhitektura): the server/engine seam, in Serbian
~2 pages into rad.md via academic-research-writer + serbian-grammar:
the two-layer split and the "does it change if you swap the engine?"
test, the statement path (do_command -> dispatch_sql_command, THD,
thread-per-connection), the handler-class seam, and the two deliberate
leaks (ICP, and engine-cardinality vs server-histogram statistics).

New source mysqlsource84 (the mysql-8.4.6 source tree) cited for every
handler-level claim, since the manual never documents that interface;
renders IEEE [3]. Three figures at budget: reused official Figure 18.3
plus the ICP on/off flame-graph pair. make-docx.ps1 builds clean, no
undefined keys. Ticket 11 resolved; map Decisions-so-far updated.

Co-Authored-By: Claude Opus 4.8 <noreply@anthropic.com>
</commit_message>
<xml_diff>
--- a/Tema 1. - Obrada upita (query processing) u MySQL/rad.docx
+++ b/Tema 1. - Obrada upita (query processing) u MySQL/rad.docx
@@ -889,7 +889,7 @@
       </w:r>
     </w:p>
     <w:bookmarkEnd w:id="12"/>
-    <w:bookmarkStart w:id="13" w:name="arhitektura-obrade-upita-u-mysql-u"/>
+    <w:bookmarkStart w:id="22" w:name="arhitektura-obrade-upita-u-mysql-u"/>
     <w:p>
       <w:pPr>
         <w:pStyle w:val="Heading1"/>
@@ -898,103 +898,36 @@
         <w:t xml:space="preserve">2. Arhitektura obrade upita u MySQL-u</w:t>
       </w:r>
     </w:p>
-    <w:bookmarkEnd w:id="13"/>
-    <w:bookmarkStart w:id="14" w:name="od-sql-a-do-plana-izvršavanja"/>
-    <w:p>
-      <w:pPr>
-        <w:pStyle w:val="Heading1"/>
-      </w:pPr>
-      <w:r>
-        <w:t xml:space="preserve">3. Od SQL-a do plana izvršavanja</w:t>
-      </w:r>
-    </w:p>
-    <w:bookmarkEnd w:id="14"/>
-    <w:bookmarkStart w:id="15" w:name="explain-i-explain-analyze"/>
-    <w:p>
-      <w:pPr>
-        <w:pStyle w:val="Heading1"/>
-      </w:pPr>
-      <w:r>
-        <w:t xml:space="preserve">4. EXPLAIN i EXPLAIN ANALYZE</w:t>
-      </w:r>
-    </w:p>
-    <w:bookmarkEnd w:id="15"/>
-    <w:bookmarkStart w:id="16" w:name="iterator-model-i-pipeline-operatora"/>
-    <w:p>
-      <w:pPr>
-        <w:pStyle w:val="Heading1"/>
-      </w:pPr>
-      <w:r>
-        <w:t xml:space="preserve">5. Iterator model i pipeline operatora</w:t>
-      </w:r>
-    </w:p>
-    <w:bookmarkEnd w:id="16"/>
-    <w:bookmarkStart w:id="17" w:name="vektorizovano-izvršavanje"/>
-    <w:p>
-      <w:pPr>
-        <w:pStyle w:val="Heading1"/>
-      </w:pPr>
-      <w:r>
-        <w:t xml:space="preserve">6. Vektorizovano izvršavanje</w:t>
-      </w:r>
-    </w:p>
-    <w:bookmarkEnd w:id="17"/>
-    <w:bookmarkStart w:id="18" w:name="paralelno-izvršavanje-upita"/>
-    <w:p>
-      <w:pPr>
-        <w:pStyle w:val="Heading1"/>
-      </w:pPr>
-      <w:r>
-        <w:t xml:space="preserve">7. Paralelno izvršavanje upita</w:t>
-      </w:r>
-    </w:p>
-    <w:bookmarkEnd w:id="18"/>
-    <w:bookmarkStart w:id="19" w:name="keširanje-i-ponovna-upotreba-planova"/>
-    <w:p>
-      <w:pPr>
-        <w:pStyle w:val="Heading1"/>
-      </w:pPr>
-      <w:r>
-        <w:t xml:space="preserve">8. Keširanje i ponovna upotreba planova</w:t>
-      </w:r>
-    </w:p>
-    <w:bookmarkEnd w:id="19"/>
-    <w:bookmarkStart w:id="20" w:name="zaključak"/>
-    <w:p>
-      <w:pPr>
-        <w:pStyle w:val="Heading1"/>
-      </w:pPr>
-      <w:r>
-        <w:t xml:space="preserve">9. Zaključak</w:t>
-      </w:r>
-    </w:p>
-    <w:bookmarkEnd w:id="20"/>
-    <w:bookmarkStart w:id="25" w:name="reference"/>
-    <w:p>
-      <w:pPr>
-        <w:pStyle w:val="Heading1"/>
-      </w:pPr>
-      <w:r>
-        <w:t xml:space="preserve">Reference</w:t>
-      </w:r>
-    </w:p>
-    <w:bookmarkStart w:id="24" w:name="refs"/>
-    <w:bookmarkStart w:id="21" w:name="ref-ramakrishnan2003"/>
-    <w:p>
-      <w:pPr>
-        <w:pStyle w:val="Bibliography"/>
-      </w:pPr>
-      <w:r>
-        <w:t xml:space="preserve">[1]</w:t>
-      </w:r>
-      <w:r>
-        <w:t xml:space="preserve"> </w:t>
-      </w:r>
-      <w:r>
-        <w:t xml:space="preserve">	</w:t>
-      </w:r>
-      <w:r>
-        <w:t xml:space="preserve">R. Ramakrishnan and J. Gehrke,</w:t>
+    <w:p>
+      <w:pPr>
+        <w:pStyle w:val="FirstParagraph"/>
+      </w:pPr>
+      <w:r>
+        <w:t xml:space="preserve">U prethodnom poglavlju obrada upita opisana je kao jaz između deklarativnog SQL-a i njegovog</w:t>
+      </w:r>
+      <w:r>
+        <w:t xml:space="preserve"> </w:t>
+      </w:r>
+      <w:r>
+        <w:t xml:space="preserve">fizičkog izvršenja. MySQL taj jaz premošćuje arhitektonskom odlukom kakvu većina drugih sistema</w:t>
+      </w:r>
+      <w:r>
+        <w:t xml:space="preserve"> </w:t>
+      </w:r>
+      <w:r>
+        <w:t xml:space="preserve">nema: sam sistem podeljen je na dva sloja, sa standardizovanim interfejsom između njih. Iznad je</w:t>
+      </w:r>
+      <w:r>
+        <w:t xml:space="preserve"> </w:t>
+      </w:r>
+      <w:r>
+        <w:t xml:space="preserve">serverski sloj, koji razume SQL: prihvata konekciju, parsira naredbu, optimizuje je i izvršava</w:t>
+      </w:r>
+      <w:r>
+        <w:t xml:space="preserve"> </w:t>
+      </w:r>
+      <w:r>
+        <w:t xml:space="preserve">izabrani plan. Ispod je mehanizam skladištenja</w:t>
       </w:r>
       <w:r>
         <w:t xml:space="preserve"> </w:t>
@@ -1004,14 +937,1295 @@
           <w:i/>
           <w:iCs/>
         </w:rPr>
+        <w:t xml:space="preserve">(storage engine)</w:t>
+      </w:r>
+      <w:r>
+        <w:t xml:space="preserve">, u nastavku kraće motor, koji</w:t>
+      </w:r>
+      <w:r>
+        <w:t xml:space="preserve"> </w:t>
+      </w:r>
+      <w:r>
+        <w:t xml:space="preserve">razume torke i stranice na disku, a o SQL-u ne zna ništa</w:t>
+      </w:r>
+      <w:r>
+        <w:t xml:space="preserve"> </w:t>
+      </w:r>
+      <w:r>
+        <w:t xml:space="preserve">[2]</w:t>
+      </w:r>
+      <w:r>
+        <w:t xml:space="preserve">. Ta podela nije stvar</w:t>
+      </w:r>
+      <w:r>
+        <w:t xml:space="preserve"> </w:t>
+      </w:r>
+      <w:r>
+        <w:t xml:space="preserve">interpretacije, već je izričito dokumentovana: modularna arhitektura pruža standardan skup usluga</w:t>
+      </w:r>
+      <w:r>
+        <w:t xml:space="preserve"> </w:t>
+      </w:r>
+      <w:r>
+        <w:t xml:space="preserve">zajedničkih svim motorima, dok su motori komponente koje stvarno izvršavaju radnje nad podacima na</w:t>
+      </w:r>
+      <w:r>
+        <w:t xml:space="preserve"> </w:t>
+      </w:r>
+      <w:r>
+        <w:t xml:space="preserve">fizičkom nivou</w:t>
+      </w:r>
+      <w:r>
+        <w:t xml:space="preserve"> </w:t>
+      </w:r>
+      <w:r>
+        <w:t xml:space="preserve">[2]</w:t>
+      </w:r>
+      <w:r>
+        <w:t xml:space="preserve">.</w:t>
+      </w:r>
+    </w:p>
+    <w:p>
+      <w:pPr>
+        <w:pStyle w:val="BodyText"/>
+      </w:pPr>
+      <w:r>
+        <w:t xml:space="preserve">Zbog te zamenljivosti organizacija se naziva modularna arhitektura motora</w:t>
+      </w:r>
+      <w:r>
+        <w:t xml:space="preserve"> </w:t>
+      </w:r>
+      <w:r>
+        <w:rPr>
+          <w:i/>
+          <w:iCs/>
+        </w:rPr>
+        <w:t xml:space="preserve">(pluggable storage engine</w:t>
+      </w:r>
+      <w:r>
+        <w:rPr>
+          <w:i/>
+          <w:iCs/>
+        </w:rPr>
+        <w:t xml:space="preserve"> </w:t>
+      </w:r>
+      <w:r>
+        <w:rPr>
+          <w:i/>
+          <w:iCs/>
+        </w:rPr>
+        <w:t xml:space="preserve">architecture)</w:t>
+      </w:r>
+      <w:r>
+        <w:t xml:space="preserve">: motor se priključuje i menja, a serverski sloj iznad njega ostaje isti. MySQL 8.4 uz</w:t>
+      </w:r>
+      <w:r>
+        <w:t xml:space="preserve"> </w:t>
+      </w:r>
+      <w:r>
+        <w:t xml:space="preserve">InnoDB isporučuje još desetak motora, među kojima su MyISAM, Memory, CSV i Archive, ali je InnoDB</w:t>
+      </w:r>
+      <w:r>
+        <w:t xml:space="preserve"> </w:t>
+      </w:r>
+      <w:r>
+        <w:t xml:space="preserve">podrazumevani i jedini koji se u ovom radu razmatra</w:t>
+      </w:r>
+      <w:r>
+        <w:t xml:space="preserve"> </w:t>
+      </w:r>
+      <w:r>
+        <w:t xml:space="preserve">[2]</w:t>
+      </w:r>
+      <w:r>
+        <w:t xml:space="preserve">. Pouzdan test kojim se utvrđuje</w:t>
+      </w:r>
+      <w:r>
+        <w:t xml:space="preserve"> </w:t>
+      </w:r>
+      <w:r>
+        <w:t xml:space="preserve">da li neka osobina pripada motoru ili serverskom sloju jednostavan je i proverljiv: menja li se ta</w:t>
+      </w:r>
+      <w:r>
+        <w:t xml:space="preserve"> </w:t>
+      </w:r>
+      <w:r>
+        <w:t xml:space="preserve">osobina kada se ista tabela prebaci na drugi motor? Priručnik na to pitanje odgovara i sam, jednom</w:t>
+      </w:r>
+      <w:r>
+        <w:t xml:space="preserve"> </w:t>
+      </w:r>
+      <w:r>
+        <w:t xml:space="preserve">fusnotom uz tabelu poređenja motora: oznaku „implementirano u serveru, a ne u mehanizmu</w:t>
+      </w:r>
+      <w:r>
+        <w:t xml:space="preserve"> </w:t>
+      </w:r>
+      <w:r>
+        <w:t xml:space="preserve">skladištenja” nose tačno dva reda, replikacija i izrada rezervne kopije, dok sve ostalo, poput</w:t>
+      </w:r>
+      <w:r>
+        <w:t xml:space="preserve"> </w:t>
+      </w:r>
+      <w:r>
+        <w:t xml:space="preserve">transakcija, MVCC-a</w:t>
+      </w:r>
+      <w:r>
+        <w:t xml:space="preserve"> </w:t>
+      </w:r>
+      <w:r>
+        <w:rPr>
+          <w:i/>
+          <w:iCs/>
+        </w:rPr>
+        <w:t xml:space="preserve">(viševerzijska kontrola konkurentnosti)</w:t>
+      </w:r>
+      <w:r>
+        <w:t xml:space="preserve">, granularnosti zaključavanja i</w:t>
+      </w:r>
+      <w:r>
+        <w:t xml:space="preserve"> </w:t>
+      </w:r>
+      <w:r>
+        <w:t xml:space="preserve">klasterovanog indeksa, varira od motora do motora i stoga ne može pripadati zajedničkom sloju</w:t>
+      </w:r>
+      <w:r>
+        <w:t xml:space="preserve"> </w:t>
+      </w:r>
+      <w:r>
+        <w:t xml:space="preserve">[2]</w:t>
+      </w:r>
+      <w:r>
+        <w:t xml:space="preserve">.</w:t>
+      </w:r>
+    </w:p>
+    <w:p>
+      <w:pPr>
+        <w:pStyle w:val="CaptionedFigure"/>
+      </w:pPr>
+      <w:r>
+        <w:drawing>
+          <wp:inline>
+            <wp:extent cx="4762500" cy="5076825"/>
+            <wp:effectExtent b="0" l="0" r="0" t="0"/>
+            <wp:docPr descr="Slika 2.1: Arhitektura MySQL-a sa modularnim mehanizmima skladištenja. Serverski sloj obuhvaćen je jedinstvenim procesom (SQL interfejs, parser, optimizator, kešovi i baferi), dok su motori (InnoDB, MyISAM, NDB Cluster, Memory) zasebni moduli ispod njega, povezani sa sistemom datoteka. Preuzeto iz priručnika [2], Figure 18.3." title="" id="14" name="Picture"/>
+            <a:graphic>
+              <a:graphicData uri="http://schemas.openxmlformats.org/drawingml/2006/picture">
+                <pic:pic>
+                  <pic:nvPicPr>
+                    <pic:cNvPr descr="figures/02-arhitektura-00-mysql-architecture-official.png" id="15" name="Picture"/>
+                    <pic:cNvPicPr>
+                      <a:picLocks noChangeArrowheads="1" noChangeAspect="1"/>
+                    </pic:cNvPicPr>
+                  </pic:nvPicPr>
+                  <pic:blipFill>
+                    <a:blip r:embed="rId13"/>
+                    <a:stretch>
+                      <a:fillRect/>
+                    </a:stretch>
+                  </pic:blipFill>
+                  <pic:spPr bwMode="auto">
+                    <a:xfrm>
+                      <a:off x="0" y="0"/>
+                      <a:ext cx="4762500" cy="5076825"/>
+                    </a:xfrm>
+                    <a:prstGeom prst="rect">
+                      <a:avLst/>
+                    </a:prstGeom>
+                    <a:noFill/>
+                    <a:ln w="9525">
+                      <a:noFill/>
+                      <a:headEnd/>
+                      <a:tailEnd/>
+                    </a:ln>
+                  </pic:spPr>
+                </pic:pic>
+              </a:graphicData>
+            </a:graphic>
+          </wp:inline>
+        </w:drawing>
+      </w:r>
+    </w:p>
+    <w:p>
+      <w:pPr>
+        <w:pStyle w:val="ImageCaption"/>
+      </w:pPr>
+      <w:r>
+        <w:t xml:space="preserve">Slika 2.1: Arhitektura MySQL-a sa modularnim mehanizmima skladištenja. Serverski sloj obuhvaćen je</w:t>
+      </w:r>
+      <w:r>
+        <w:t xml:space="preserve"> </w:t>
+      </w:r>
+      <w:r>
+        <w:t xml:space="preserve">jedinstvenim procesom (SQL interfejs, parser, optimizator, kešovi i baferi), dok su motori (InnoDB,</w:t>
+      </w:r>
+      <w:r>
+        <w:t xml:space="preserve"> </w:t>
+      </w:r>
+      <w:r>
+        <w:t xml:space="preserve">MyISAM, NDB Cluster, Memory) zasebni moduli ispod njega, povezani sa sistemom datoteka. Preuzeto iz</w:t>
+      </w:r>
+      <w:r>
+        <w:t xml:space="preserve"> </w:t>
+      </w:r>
+      <w:r>
+        <w:t xml:space="preserve">priručnika</w:t>
+      </w:r>
+      <w:r>
+        <w:t xml:space="preserve"> </w:t>
+      </w:r>
+      <w:r>
+        <w:t xml:space="preserve">[2]</w:t>
+      </w:r>
+      <w:r>
+        <w:t xml:space="preserve">, Figure 18.3.</w:t>
+      </w:r>
+    </w:p>
+    <w:p>
+      <w:pPr>
+        <w:pStyle w:val="BodyText"/>
+      </w:pPr>
+      <w:r>
+        <w:t xml:space="preserve">Slika 2.1 prikazuje tu podelu onako kako je crta sam priručnik. Sve što serverski sloj radi smešteno</w:t>
+      </w:r>
+      <w:r>
+        <w:t xml:space="preserve"> </w:t>
+      </w:r>
+      <w:r>
+        <w:t xml:space="preserve">je u jedinstven proces, dok su motori zasebni i zamenljivi moduli ispod njega, povezani sa sistemom</w:t>
+      </w:r>
+      <w:r>
+        <w:t xml:space="preserve"> </w:t>
+      </w:r>
+      <w:r>
+        <w:t xml:space="preserve">datoteka. Za obradu upita bitna je samo granica između tog procesa i modula ispod njega: to je</w:t>
+      </w:r>
+      <w:r>
+        <w:t xml:space="preserve"> </w:t>
+      </w:r>
+      <w:r>
+        <w:t xml:space="preserve">linija preko koje naredba prelazi iz sveta SQL-a u svet torki i stranica</w:t>
+      </w:r>
+      <w:r>
+        <w:t xml:space="preserve"> </w:t>
+      </w:r>
+      <w:r>
+        <w:t xml:space="preserve">[2]</w:t>
+      </w:r>
+      <w:r>
+        <w:t xml:space="preserve">.</w:t>
+      </w:r>
+    </w:p>
+    <w:p>
+      <w:pPr>
+        <w:pStyle w:val="BodyText"/>
+      </w:pPr>
+      <w:r>
+        <w:t xml:space="preserve">Put jedne naredbe kroz serverski sloj ima jasan redosled, a koraci nose imena koja postoje u izvornom</w:t>
+      </w:r>
+      <w:r>
+        <w:t xml:space="preserve"> </w:t>
+      </w:r>
+      <w:r>
+        <w:t xml:space="preserve">kodu MySQL-a 8.4. Nit dodeljena konekciji čita komandu sa mreže, najpre kroz funkciju</w:t>
+      </w:r>
+      <w:r>
+        <w:t xml:space="preserve"> </w:t>
+      </w:r>
+      <w:r>
+        <w:rPr>
+          <w:rStyle w:val="VerbatimChar"/>
+        </w:rPr>
+        <w:t xml:space="preserve">do_command</w:t>
+      </w:r>
+      <w:r>
+        <w:t xml:space="preserve">,</w:t>
+      </w:r>
+      <w:r>
+        <w:t xml:space="preserve"> </w:t>
+      </w:r>
+      <w:r>
+        <w:t xml:space="preserve">a potom</w:t>
+      </w:r>
+      <w:r>
+        <w:t xml:space="preserve"> </w:t>
+      </w:r>
+      <w:r>
+        <w:rPr>
+          <w:rStyle w:val="VerbatimChar"/>
+        </w:rPr>
+        <w:t xml:space="preserve">dispatch_command</w:t>
+      </w:r>
+      <w:r>
+        <w:t xml:space="preserve">; tek ulazna tačka</w:t>
+      </w:r>
+      <w:r>
+        <w:t xml:space="preserve"> </w:t>
+      </w:r>
+      <w:r>
+        <w:rPr>
+          <w:rStyle w:val="VerbatimChar"/>
+        </w:rPr>
+        <w:t xml:space="preserve">dispatch_sql_command</w:t>
+      </w:r>
+      <w:r>
+        <w:t xml:space="preserve"> </w:t>
+      </w:r>
+      <w:r>
+        <w:t xml:space="preserve">započinje obradu SQL-a: tekst se</w:t>
+      </w:r>
+      <w:r>
+        <w:t xml:space="preserve"> </w:t>
+      </w:r>
+      <w:r>
+        <w:t xml:space="preserve">parsira u sintaksno stablo, imena tabela i kolona se razrešavaju i trajno transformišu, optimizator</w:t>
+      </w:r>
+      <w:r>
+        <w:t xml:space="preserve"> </w:t>
+      </w:r>
+      <w:r>
+        <w:t xml:space="preserve">bira redosled spoja i pristupni put po ceni, a izvršilac izabrani plan pretvara u stablo iteratora</w:t>
+      </w:r>
+      <w:r>
+        <w:t xml:space="preserve"> </w:t>
+      </w:r>
+      <w:r>
+        <w:t xml:space="preserve">[3]</w:t>
+      </w:r>
+      <w:r>
+        <w:t xml:space="preserve">. Kroz sve korake putuje jedan isti objekat,</w:t>
+      </w:r>
+      <w:r>
+        <w:t xml:space="preserve"> </w:t>
+      </w:r>
+      <w:r>
+        <w:rPr>
+          <w:rStyle w:val="VerbatimChar"/>
+        </w:rPr>
+        <w:t xml:space="preserve">THD</w:t>
+      </w:r>
+      <w:r>
+        <w:t xml:space="preserve">, u kodu opisan kao deskriptor</w:t>
+      </w:r>
+      <w:r>
+        <w:t xml:space="preserve"> </w:t>
+      </w:r>
+      <w:r>
+        <w:t xml:space="preserve">niti i konekcije. Sistemska promenljiva</w:t>
+      </w:r>
+      <w:r>
+        <w:t xml:space="preserve"> </w:t>
+      </w:r>
+      <w:r>
+        <w:rPr>
+          <w:rStyle w:val="VerbatimChar"/>
+        </w:rPr>
+        <w:t xml:space="preserve">thread_handling</w:t>
+      </w:r>
+      <w:r>
+        <w:t xml:space="preserve"> </w:t>
+      </w:r>
+      <w:r>
+        <w:t xml:space="preserve">podrazumevano ima vrednost</w:t>
+      </w:r>
+      <w:r>
+        <w:t xml:space="preserve"> </w:t>
+      </w:r>
+      <w:r>
+        <w:rPr>
+          <w:rStyle w:val="VerbatimChar"/>
+        </w:rPr>
+        <w:t xml:space="preserve">one-thread-per-connection</w:t>
+      </w:r>
+      <w:r>
+        <w:t xml:space="preserve">, dakle jedna nit po konekciji</w:t>
+      </w:r>
+      <w:r>
+        <w:t xml:space="preserve"> </w:t>
+      </w:r>
+      <w:r>
+        <w:t xml:space="preserve">[2], [3]</w:t>
+      </w:r>
+      <w:r>
+        <w:t xml:space="preserve">. Ta</w:t>
+      </w:r>
+      <w:r>
+        <w:t xml:space="preserve"> </w:t>
+      </w:r>
+      <w:r>
+        <w:t xml:space="preserve">činjenica biće bitna u poglavlju 7, jer je paralelnost u MySQL-u pre svega između konekcija, a ne</w:t>
+      </w:r>
+      <w:r>
+        <w:t xml:space="preserve"> </w:t>
+      </w:r>
+      <w:r>
+        <w:t xml:space="preserve">unutar jednog upita.</w:t>
+      </w:r>
+    </w:p>
+    <w:p>
+      <w:pPr>
+        <w:pStyle w:val="BodyText"/>
+      </w:pPr>
+      <w:r>
+        <w:t xml:space="preserve">Interfejs između dva sloja nije apstrakcija na papiru, nego konkretna C++ klasa</w:t>
+      </w:r>
+      <w:r>
+        <w:t xml:space="preserve"> </w:t>
+      </w:r>
+      <w:r>
+        <w:rPr>
+          <w:rStyle w:val="VerbatimChar"/>
+        </w:rPr>
+        <w:t xml:space="preserve">handler</w:t>
+      </w:r>
+      <w:r>
+        <w:t xml:space="preserve">, koju</w:t>
+      </w:r>
+      <w:r>
+        <w:t xml:space="preserve"> </w:t>
+      </w:r>
+      <w:r>
+        <w:t xml:space="preserve">izvorni kod opisuje kao interfejs za motore koji se dinamički učitavaju; uz nju stoji</w:t>
+      </w:r>
+      <w:r>
+        <w:t xml:space="preserve"> </w:t>
+      </w:r>
+      <w:r>
+        <w:rPr>
+          <w:rStyle w:val="VerbatimChar"/>
+        </w:rPr>
+        <w:t xml:space="preserve">handlerton</w:t>
+      </w:r>
+      <w:r>
+        <w:t xml:space="preserve">,</w:t>
+      </w:r>
+      <w:r>
+        <w:t xml:space="preserve"> </w:t>
+      </w:r>
+      <w:r>
+        <w:t xml:space="preserve">po jedna instanca za ceo motor, dok</w:t>
+      </w:r>
+      <w:r>
+        <w:t xml:space="preserve"> </w:t>
+      </w:r>
+      <w:r>
+        <w:rPr>
+          <w:rStyle w:val="VerbatimChar"/>
+        </w:rPr>
+        <w:t xml:space="preserve">handler</w:t>
+      </w:r>
+      <w:r>
+        <w:t xml:space="preserve"> </w:t>
+      </w:r>
+      <w:r>
+        <w:t xml:space="preserve">radi po pojedinačnoj tabeli</w:t>
+      </w:r>
+      <w:r>
+        <w:t xml:space="preserve"> </w:t>
+      </w:r>
+      <w:r>
+        <w:t xml:space="preserve">[3]</w:t>
+      </w:r>
+      <w:r>
+        <w:t xml:space="preserve">. Značaj te</w:t>
+      </w:r>
+      <w:r>
+        <w:t xml:space="preserve"> </w:t>
+      </w:r>
+      <w:r>
+        <w:t xml:space="preserve">klase za obradu upita najbolje se vidi na iteratoru koji čita celu tabelu: u svom telu on ne radi</w:t>
+      </w:r>
+      <w:r>
+        <w:t xml:space="preserve"> </w:t>
+      </w:r>
+      <w:r>
+        <w:t xml:space="preserve">ništa nalik čitanju diska, već poziva metodu motora</w:t>
+      </w:r>
+      <w:r>
+        <w:t xml:space="preserve"> </w:t>
+      </w:r>
+      <w:r>
+        <w:rPr>
+          <w:rStyle w:val="VerbatimChar"/>
+        </w:rPr>
+        <w:t xml:space="preserve">ha_rnd_next</w:t>
+      </w:r>
+      <w:r>
+        <w:t xml:space="preserve"> </w:t>
+      </w:r>
+      <w:r>
+        <w:t xml:space="preserve">nad pokazivačem</w:t>
+      </w:r>
+      <w:r>
+        <w:t xml:space="preserve"> </w:t>
+      </w:r>
+      <w:r>
+        <w:rPr>
+          <w:rStyle w:val="VerbatimChar"/>
+        </w:rPr>
+        <w:t xml:space="preserve">table()-&gt;file</w:t>
+      </w:r>
+      <w:r>
+        <w:t xml:space="preserve">,</w:t>
+      </w:r>
+      <w:r>
+        <w:t xml:space="preserve"> </w:t>
+      </w:r>
+      <w:r>
+        <w:t xml:space="preserve">koji je tipa</w:t>
+      </w:r>
+      <w:r>
+        <w:t xml:space="preserve"> </w:t>
+      </w:r>
+      <w:r>
+        <w:rPr>
+          <w:rStyle w:val="VerbatimChar"/>
+        </w:rPr>
+        <w:t xml:space="preserve">handler</w:t>
+      </w:r>
+      <w:r>
+        <w:t xml:space="preserve">, i čeka da mu motor vrati sledeću torku</w:t>
+      </w:r>
+      <w:r>
+        <w:t xml:space="preserve"> </w:t>
+      </w:r>
+      <w:r>
+        <w:t xml:space="preserve">[3]</w:t>
+      </w:r>
+      <w:r>
+        <w:t xml:space="preserve">. Kako je motor tu</w:t>
+      </w:r>
+      <w:r>
+        <w:t xml:space="preserve"> </w:t>
+      </w:r>
+      <w:r>
+        <w:t xml:space="preserve">torku pronašao, iz bafer pula</w:t>
+      </w:r>
+      <w:r>
+        <w:t xml:space="preserve"> </w:t>
+      </w:r>
+      <w:r>
+        <w:rPr>
+          <w:i/>
+          <w:iCs/>
+        </w:rPr>
+        <w:t xml:space="preserve">(buffer pool)</w:t>
+      </w:r>
+      <w:r>
+        <w:t xml:space="preserve">, sa diska ili silaskom kroz B+ stablo, serverski sloj</w:t>
+      </w:r>
+      <w:r>
+        <w:t xml:space="preserve"> </w:t>
+      </w:r>
+      <w:r>
+        <w:t xml:space="preserve">ne zna niti treba da zna. U tome i jeste suština podele: serverski sloj odlučuje koje torke želi i</w:t>
+      </w:r>
+      <w:r>
+        <w:t xml:space="preserve"> </w:t>
+      </w:r>
+      <w:r>
+        <w:t xml:space="preserve">kojim redom da ih spoji, a motor odlučuje kako se torka fizički pronalazi, kešira, zaključava i u</w:t>
+      </w:r>
+      <w:r>
+        <w:t xml:space="preserve"> </w:t>
+      </w:r>
+      <w:r>
+        <w:t xml:space="preserve">kojoj se verziji čita</w:t>
+      </w:r>
+      <w:r>
+        <w:t xml:space="preserve"> </w:t>
+      </w:r>
+      <w:r>
+        <w:t xml:space="preserve">[2]</w:t>
+      </w:r>
+      <w:r>
+        <w:t xml:space="preserve">.</w:t>
+      </w:r>
+    </w:p>
+    <w:p>
+      <w:pPr>
+        <w:pStyle w:val="BodyText"/>
+      </w:pPr>
+      <w:r>
+        <w:t xml:space="preserve">Ta podela, međutim, na dva mesta namerno propušta, a oba se mogu pokazati na živom serveru. Prvo je</w:t>
+      </w:r>
+      <w:r>
+        <w:t xml:space="preserve"> </w:t>
+      </w:r>
+      <w:r>
+        <w:t xml:space="preserve">spuštanje uslova u indeks</w:t>
+      </w:r>
+      <w:r>
+        <w:t xml:space="preserve"> </w:t>
+      </w:r>
+      <w:r>
+        <w:rPr>
+          <w:i/>
+          <w:iCs/>
+        </w:rPr>
+        <w:t xml:space="preserve">(index condition pushdown, ICP)</w:t>
+      </w:r>
+      <w:r>
+        <w:t xml:space="preserve">. Da je granica savršeno čista, motor bi</w:t>
+      </w:r>
+      <w:r>
+        <w:t xml:space="preserve"> </w:t>
+      </w:r>
+      <w:r>
+        <w:t xml:space="preserve">vraćao torke a serverski sloj bi ih filtrirao, ali bi tada i torke koje će svakako biti odbačene</w:t>
+      </w:r>
+      <w:r>
+        <w:t xml:space="preserve"> </w:t>
+      </w:r>
+      <w:r>
+        <w:t xml:space="preserve">morale da pređu granicu. Da to izbegne, serverski sloj deo uslova iz</w:t>
+      </w:r>
+      <w:r>
+        <w:t xml:space="preserve"> </w:t>
+      </w:r>
+      <w:r>
+        <w:rPr>
+          <w:rStyle w:val="VerbatimChar"/>
+        </w:rPr>
+        <w:t xml:space="preserve">WHERE</w:t>
+      </w:r>
+      <w:r>
+        <w:t xml:space="preserve"> </w:t>
+      </w:r>
+      <w:r>
+        <w:t xml:space="preserve">klauzule prosleđuje</w:t>
+      </w:r>
+      <w:r>
+        <w:t xml:space="preserve"> </w:t>
+      </w:r>
+      <w:r>
+        <w:t xml:space="preserve">motoru, metodom</w:t>
+      </w:r>
+      <w:r>
+        <w:t xml:space="preserve"> </w:t>
+      </w:r>
+      <w:r>
+        <w:rPr>
+          <w:rStyle w:val="VerbatimChar"/>
+        </w:rPr>
+        <w:t xml:space="preserve">idx_cond_push</w:t>
+      </w:r>
+      <w:r>
+        <w:t xml:space="preserve">, kroz koju prolazi</w:t>
+      </w:r>
+      <w:r>
+        <w:t xml:space="preserve"> </w:t>
+      </w:r>
+      <w:r>
+        <w:rPr>
+          <w:rStyle w:val="VerbatimChar"/>
+        </w:rPr>
+        <w:t xml:space="preserve">Item*</w:t>
+      </w:r>
+      <w:r>
+        <w:t xml:space="preserve">, čvor izraza iz serverskog sloja; motor</w:t>
+      </w:r>
+      <w:r>
+        <w:t xml:space="preserve"> </w:t>
+      </w:r>
+      <w:r>
+        <w:t xml:space="preserve">taj uslov proverava nad torkom indeksa i tek ako je zadovoljen dohvata punu torku iz tabele</w:t>
+      </w:r>
+      <w:r>
+        <w:t xml:space="preserve"> </w:t>
+      </w:r>
+      <w:r>
+        <w:t xml:space="preserve">[2], [3]</w:t>
+      </w:r>
+      <w:r>
+        <w:t xml:space="preserve">.</w:t>
+      </w:r>
+    </w:p>
+    <w:p>
+      <w:pPr>
+        <w:pStyle w:val="CaptionedFigure"/>
+      </w:pPr>
+      <w:r>
+        <w:drawing>
+          <wp:inline>
+            <wp:extent cx="5334000" cy="1241636"/>
+            <wp:effectExtent b="0" l="0" r="0" t="0"/>
+            <wp:docPr descr="Slika 2.2: Plan upita sa uključenim spuštanjem uslova u indeks (ICP): jedan čvor, sken opsega preko indeksa idx_customer_created, sa uslovom označenim kao with index condition unutar samog skena. Plameni grafikon dobijen iz EXPLAIN ANALYZE FORMAT=JSON, izmereno na živom serveru (MySQL 8.4.11)." title="" id="17" name="Picture"/>
+            <a:graphic>
+              <a:graphicData uri="http://schemas.openxmlformats.org/drawingml/2006/picture">
+                <pic:pic>
+                  <pic:nvPicPr>
+                    <pic:cNvPr descr="figures/02-arhitektura-01-icp-ukljucen.png" id="18" name="Picture"/>
+                    <pic:cNvPicPr>
+                      <a:picLocks noChangeArrowheads="1" noChangeAspect="1"/>
+                    </pic:cNvPicPr>
+                  </pic:nvPicPr>
+                  <pic:blipFill>
+                    <a:blip r:embed="rId16"/>
+                    <a:stretch>
+                      <a:fillRect/>
+                    </a:stretch>
+                  </pic:blipFill>
+                  <pic:spPr bwMode="auto">
+                    <a:xfrm>
+                      <a:off x="0" y="0"/>
+                      <a:ext cx="5334000" cy="1241636"/>
+                    </a:xfrm>
+                    <a:prstGeom prst="rect">
+                      <a:avLst/>
+                    </a:prstGeom>
+                    <a:noFill/>
+                    <a:ln w="9525">
+                      <a:noFill/>
+                      <a:headEnd/>
+                      <a:tailEnd/>
+                    </a:ln>
+                  </pic:spPr>
+                </pic:pic>
+              </a:graphicData>
+            </a:graphic>
+          </wp:inline>
+        </w:drawing>
+      </w:r>
+    </w:p>
+    <w:p>
+      <w:pPr>
+        <w:pStyle w:val="ImageCaption"/>
+      </w:pPr>
+      <w:r>
+        <w:t xml:space="preserve">Slika 2.2: Plan upita sa uključenim spuštanjem uslova u indeks (ICP): jedan čvor, sken opsega preko</w:t>
+      </w:r>
+      <w:r>
+        <w:t xml:space="preserve"> </w:t>
+      </w:r>
+      <w:r>
+        <w:t xml:space="preserve">indeksa</w:t>
+      </w:r>
+      <w:r>
+        <w:t xml:space="preserve"> </w:t>
+      </w:r>
+      <w:r>
+        <w:rPr>
+          <w:rStyle w:val="VerbatimChar"/>
+        </w:rPr>
+        <w:t xml:space="preserve">idx_customer_created</w:t>
+      </w:r>
+      <w:r>
+        <w:t xml:space="preserve">, sa uslovom označenim kao</w:t>
+      </w:r>
+      <w:r>
+        <w:t xml:space="preserve"> </w:t>
+      </w:r>
+      <w:r>
+        <w:rPr>
+          <w:rStyle w:val="VerbatimChar"/>
+        </w:rPr>
+        <w:t xml:space="preserve">with index condition</w:t>
+      </w:r>
+      <w:r>
+        <w:t xml:space="preserve"> </w:t>
+      </w:r>
+      <w:r>
+        <w:t xml:space="preserve">unutar samog skena.</w:t>
+      </w:r>
+      <w:r>
+        <w:t xml:space="preserve"> </w:t>
+      </w:r>
+      <w:r>
+        <w:t xml:space="preserve">Plameni grafikon dobijen iz</w:t>
+      </w:r>
+      <w:r>
+        <w:t xml:space="preserve"> </w:t>
+      </w:r>
+      <w:r>
+        <w:rPr>
+          <w:rStyle w:val="VerbatimChar"/>
+        </w:rPr>
+        <w:t xml:space="preserve">EXPLAIN ANALYZE FORMAT=JSON</w:t>
+      </w:r>
+      <w:r>
+        <w:t xml:space="preserve">, izmereno na živom serveru (MySQL</w:t>
+      </w:r>
+      <w:r>
+        <w:t xml:space="preserve"> </w:t>
+      </w:r>
+      <w:r>
+        <w:t xml:space="preserve">8.4.11).</w:t>
+      </w:r>
+    </w:p>
+    <w:p>
+      <w:pPr>
+        <w:pStyle w:val="CaptionedFigure"/>
+      </w:pPr>
+      <w:r>
+        <w:drawing>
+          <wp:inline>
+            <wp:extent cx="5334000" cy="1336463"/>
+            <wp:effectExtent b="0" l="0" r="0" t="0"/>
+            <wp:docPr descr="Slika 2.3: Isti upit sa isključenim spuštanjem uslova: iznad skena se pojavljuje zaseban čvor Filter, koji obavlja serverski sloj. Sken propušta 499.297 torki, a filter zadržava 165.707; razlika od 333.590 torki prelazi granicu samo da bi bila odbačena." title="" id="20" name="Picture"/>
+            <a:graphic>
+              <a:graphicData uri="http://schemas.openxmlformats.org/drawingml/2006/picture">
+                <pic:pic>
+                  <pic:nvPicPr>
+                    <pic:cNvPr descr="figures/02-arhitektura-02-icp-iskljucen.png" id="21" name="Picture"/>
+                    <pic:cNvPicPr>
+                      <a:picLocks noChangeArrowheads="1" noChangeAspect="1"/>
+                    </pic:cNvPicPr>
+                  </pic:nvPicPr>
+                  <pic:blipFill>
+                    <a:blip r:embed="rId19"/>
+                    <a:stretch>
+                      <a:fillRect/>
+                    </a:stretch>
+                  </pic:blipFill>
+                  <pic:spPr bwMode="auto">
+                    <a:xfrm>
+                      <a:off x="0" y="0"/>
+                      <a:ext cx="5334000" cy="1336463"/>
+                    </a:xfrm>
+                    <a:prstGeom prst="rect">
+                      <a:avLst/>
+                    </a:prstGeom>
+                    <a:noFill/>
+                    <a:ln w="9525">
+                      <a:noFill/>
+                      <a:headEnd/>
+                      <a:tailEnd/>
+                    </a:ln>
+                  </pic:spPr>
+                </pic:pic>
+              </a:graphicData>
+            </a:graphic>
+          </wp:inline>
+        </w:drawing>
+      </w:r>
+    </w:p>
+    <w:p>
+      <w:pPr>
+        <w:pStyle w:val="ImageCaption"/>
+      </w:pPr>
+      <w:r>
+        <w:t xml:space="preserve">Slika 2.3: Isti upit sa isključenim spuštanjem uslova: iznad skena se pojavljuje zaseban čvor</w:t>
+      </w:r>
+      <w:r>
+        <w:t xml:space="preserve"> </w:t>
+      </w:r>
+      <w:r>
+        <w:rPr>
+          <w:rStyle w:val="VerbatimChar"/>
+        </w:rPr>
+        <w:t xml:space="preserve">Filter</w:t>
+      </w:r>
+      <w:r>
+        <w:t xml:space="preserve">, koji obavlja serverski sloj. Sken propušta 499.297 torki, a filter zadržava 165.707;</w:t>
+      </w:r>
+      <w:r>
+        <w:t xml:space="preserve"> </w:t>
+      </w:r>
+      <w:r>
+        <w:t xml:space="preserve">razlika od 333.590 torki prelazi granicu samo da bi bila odbačena.</w:t>
+      </w:r>
+    </w:p>
+    <w:p>
+      <w:pPr>
+        <w:pStyle w:val="BodyText"/>
+      </w:pPr>
+      <w:r>
+        <w:t xml:space="preserve">Slike 2.2 i 2.3 prikazuju isti upit nad tabelom</w:t>
+      </w:r>
+      <w:r>
+        <w:t xml:space="preserve"> </w:t>
+      </w:r>
+      <w:r>
+        <w:rPr>
+          <w:rStyle w:val="VerbatimChar"/>
+        </w:rPr>
+        <w:t xml:space="preserve">wide_events</w:t>
+      </w:r>
+      <w:r>
+        <w:t xml:space="preserve">, sa uključenim i sa isključenim</w:t>
+      </w:r>
+      <w:r>
+        <w:t xml:space="preserve"> </w:t>
+      </w:r>
+      <w:r>
+        <w:t xml:space="preserve">spuštanjem uslova. Pristupni put je u oba slučaja isti sken opsega preko istog indeksa, pa se menja</w:t>
+      </w:r>
+      <w:r>
+        <w:t xml:space="preserve"> </w:t>
+      </w:r>
+      <w:r>
+        <w:t xml:space="preserve">samo broj čvorova u planu. Kada je spuštanje isključeno (Slika 2.3), iznad skena stoji zaseban čvor</w:t>
+      </w:r>
+      <w:r>
+        <w:t xml:space="preserve"> </w:t>
+      </w:r>
+      <w:r>
+        <w:rPr>
+          <w:rStyle w:val="VerbatimChar"/>
+        </w:rPr>
+        <w:t xml:space="preserve">Filter</w:t>
+      </w:r>
+      <w:r>
+        <w:t xml:space="preserve">, koji obavlja serverski sloj: sken mu dodaje 499.297 torki, a filter propušta njih 165.707,</w:t>
+      </w:r>
+      <w:r>
+        <w:t xml:space="preserve"> </w:t>
+      </w:r>
+      <w:r>
+        <w:t xml:space="preserve">pa je 333.590 torki prešlo granicu samo da bi odmah bilo odbačeno. Kada je spuštanje uključeno (Slika</w:t>
+      </w:r>
+      <w:r>
+        <w:t xml:space="preserve"> </w:t>
+      </w:r>
+      <w:r>
+        <w:t xml:space="preserve">2.2), čvor</w:t>
+      </w:r>
+      <w:r>
+        <w:t xml:space="preserve"> </w:t>
+      </w:r>
+      <w:r>
+        <w:rPr>
+          <w:rStyle w:val="VerbatimChar"/>
+        </w:rPr>
+        <w:t xml:space="preserve">Filter</w:t>
+      </w:r>
+      <w:r>
+        <w:t xml:space="preserve"> </w:t>
+      </w:r>
+      <w:r>
+        <w:t xml:space="preserve">nestaje jer isti uslov proverava motor, nad torkom indeksa, pre nego što uopšte</w:t>
+      </w:r>
+      <w:r>
+        <w:t xml:space="preserve"> </w:t>
+      </w:r>
+      <w:r>
+        <w:t xml:space="preserve">dohvati široku torku; rezultat je istovetan, a razlika je jedino u tome koji sloj obavlja filtriranje</w:t>
+      </w:r>
+      <w:r>
+        <w:t xml:space="preserve"> </w:t>
+      </w:r>
+      <w:r>
+        <w:t xml:space="preserve">[2]</w:t>
+      </w:r>
+      <w:r>
+        <w:t xml:space="preserve">. Upravo zato je ovo najuverljiviji dokaz da granica postoji: ona se u planu vidi kao</w:t>
+      </w:r>
+      <w:r>
+        <w:t xml:space="preserve"> </w:t>
+      </w:r>
+      <w:r>
+        <w:t xml:space="preserve">pojava, odnosno nestanak jednog čvora.</w:t>
+      </w:r>
+    </w:p>
+    <w:p>
+      <w:pPr>
+        <w:pStyle w:val="BodyText"/>
+      </w:pPr>
+      <w:r>
+        <w:t xml:space="preserve">Drugo mesto na kome podela propušta jeste statistika kojom optimizator procenjuje koliko će torki</w:t>
+      </w:r>
+      <w:r>
+        <w:t xml:space="preserve"> </w:t>
+      </w:r>
+      <w:r>
+        <w:t xml:space="preserve">neki korak vratiti: odgovor stiže sa obe strane granice, iz dva izvora koji se mogu, ali i ne moraju</w:t>
+      </w:r>
+      <w:r>
+        <w:t xml:space="preserve"> </w:t>
+      </w:r>
+      <w:r>
+        <w:t xml:space="preserve">slagati. Motor daje kardinalnost indeksa, to jest broj različitih vrednosti, i to procenom: InnoDB</w:t>
+      </w:r>
+      <w:r>
+        <w:t xml:space="preserve"> </w:t>
+      </w:r>
+      <w:r>
+        <w:t xml:space="preserve">je dobija uzorkovanjem stranica indeksa, a ne čitanjem svih torki, pa se ta vrednost čuva u</w:t>
+      </w:r>
+      <w:r>
+        <w:t xml:space="preserve"> </w:t>
+      </w:r>
+      <w:r>
+        <w:t xml:space="preserve">motorovoj tabeli</w:t>
+      </w:r>
+      <w:r>
+        <w:t xml:space="preserve"> </w:t>
+      </w:r>
+      <w:r>
+        <w:rPr>
+          <w:rStyle w:val="VerbatimChar"/>
+        </w:rPr>
+        <w:t xml:space="preserve">mysql.innodb_index_stats</w:t>
+      </w:r>
+      <w:r>
+        <w:t xml:space="preserve"> </w:t>
+      </w:r>
+      <w:r>
+        <w:t xml:space="preserve">[2]</w:t>
+      </w:r>
+      <w:r>
+        <w:t xml:space="preserve">. Serverski sloj, sa svoje strane,</w:t>
+      </w:r>
+      <w:r>
+        <w:t xml:space="preserve"> </w:t>
+      </w:r>
+      <w:r>
+        <w:t xml:space="preserve">održava histogram, raspodelu vrednosti po kanticama, koji se izričito traži naredbom</w:t>
+      </w:r>
+      <w:r>
+        <w:t xml:space="preserve"> </w:t>
+      </w:r>
+      <w:r>
+        <w:rPr>
+          <w:rStyle w:val="VerbatimChar"/>
+        </w:rPr>
+        <w:t xml:space="preserve">ANALYZE TABLE ... UPDATE HISTOGRAM</w:t>
+      </w:r>
+      <w:r>
+        <w:t xml:space="preserve"> </w:t>
+      </w:r>
+      <w:r>
+        <w:t xml:space="preserve">i čuva u rečniku podataka</w:t>
+      </w:r>
+      <w:r>
+        <w:t xml:space="preserve"> </w:t>
+      </w:r>
+      <w:r>
+        <w:rPr>
+          <w:i/>
+          <w:iCs/>
+        </w:rPr>
+        <w:t xml:space="preserve">(data dictionary)</w:t>
+      </w:r>
+      <w:r>
+        <w:t xml:space="preserve">, odvojeno od</w:t>
+      </w:r>
+      <w:r>
+        <w:t xml:space="preserve"> </w:t>
+      </w:r>
+      <w:r>
+        <w:t xml:space="preserve">motora</w:t>
+      </w:r>
+      <w:r>
+        <w:t xml:space="preserve"> </w:t>
+      </w:r>
+      <w:r>
+        <w:t xml:space="preserve">[2]</w:t>
+      </w:r>
+      <w:r>
+        <w:t xml:space="preserve">. Na koloni</w:t>
+      </w:r>
+      <w:r>
+        <w:t xml:space="preserve"> </w:t>
+      </w:r>
+      <w:r>
+        <w:rPr>
+          <w:rStyle w:val="VerbatimChar"/>
+        </w:rPr>
+        <w:t xml:space="preserve">country_code</w:t>
+      </w:r>
+      <w:r>
+        <w:t xml:space="preserve"> </w:t>
+      </w:r>
+      <w:r>
+        <w:t xml:space="preserve">sintetičke tabele razlika je merljiva: motor iz</w:t>
+      </w:r>
+      <w:r>
+        <w:t xml:space="preserve"> </w:t>
+      </w:r>
+      <w:r>
+        <w:t xml:space="preserve">uzorka od 16 stranica, od ukupno 5.082, procenjuje 14 različitih vrednosti, dok server histogramom</w:t>
+      </w:r>
+      <w:r>
+        <w:t xml:space="preserve"> </w:t>
+      </w:r>
+      <w:r>
+        <w:t xml:space="preserve">nalazi tačnih 15 i, što je važnije, beleži da vrednost</w:t>
+      </w:r>
+      <w:r>
+        <w:t xml:space="preserve"> </w:t>
+      </w:r>
+      <w:r>
+        <w:rPr>
+          <w:rStyle w:val="VerbatimChar"/>
+        </w:rPr>
+        <w:t xml:space="preserve">US</w:t>
+      </w:r>
+      <w:r>
+        <w:t xml:space="preserve"> </w:t>
+      </w:r>
+      <w:r>
+        <w:t xml:space="preserve">zauzima oko 70% tabele, dok bi se iz same</w:t>
+      </w:r>
+      <w:r>
+        <w:t xml:space="preserve"> </w:t>
+      </w:r>
+      <w:r>
+        <w:t xml:space="preserve">kardinalnosti mogla izvesti tek ravnomerna raspodela od približno 7% po vrednosti</w:t>
+      </w:r>
+      <w:r>
+        <w:t xml:space="preserve"> </w:t>
+      </w:r>
+      <w:r>
+        <w:t xml:space="preserve">[2]</w:t>
+      </w:r>
+      <w:r>
+        <w:t xml:space="preserve">.</w:t>
+      </w:r>
+      <w:r>
+        <w:t xml:space="preserve"> </w:t>
+      </w:r>
+      <w:r>
+        <w:t xml:space="preserve">Pravilo koje sažima ovu podelu glasi: statistika indeksa pripada motoru, a histogrami kolona</w:t>
+      </w:r>
+      <w:r>
+        <w:t xml:space="preserve"> </w:t>
+      </w:r>
+      <w:r>
+        <w:t xml:space="preserve">serverskom sloju.</w:t>
+      </w:r>
+    </w:p>
+    <w:p>
+      <w:pPr>
+        <w:pStyle w:val="BodyText"/>
+      </w:pPr>
+      <w:r>
+        <w:t xml:space="preserve">Time su određene dve komponente na kojima počivaju naredna poglavlja: serverski sloj, koji SQL upit</w:t>
+      </w:r>
+      <w:r>
+        <w:t xml:space="preserve"> </w:t>
+      </w:r>
+      <w:r>
+        <w:t xml:space="preserve">pretvara u plan, i motor, koji taj plan izvršava nad stvarnim torkama. Poglavlje 3 ulazi u prvu od</w:t>
+      </w:r>
+      <w:r>
+        <w:t xml:space="preserve"> </w:t>
+      </w:r>
+      <w:r>
+        <w:t xml:space="preserve">njih i prati put od SQL naredbe do plana izvršavanja, od preformulacije relacione algebre do fizičkog</w:t>
+      </w:r>
+      <w:r>
+        <w:t xml:space="preserve"> </w:t>
+      </w:r>
+      <w:r>
+        <w:t xml:space="preserve">plana nad konkretnim primerom.</w:t>
+      </w:r>
+    </w:p>
+    <w:bookmarkEnd w:id="22"/>
+    <w:bookmarkStart w:id="23" w:name="od-sql-a-do-plana-izvršavanja"/>
+    <w:p>
+      <w:pPr>
+        <w:pStyle w:val="Heading1"/>
+      </w:pPr>
+      <w:r>
+        <w:t xml:space="preserve">3. Od SQL-a do plana izvršavanja</w:t>
+      </w:r>
+    </w:p>
+    <w:bookmarkEnd w:id="23"/>
+    <w:bookmarkStart w:id="24" w:name="explain-i-explain-analyze"/>
+    <w:p>
+      <w:pPr>
+        <w:pStyle w:val="Heading1"/>
+      </w:pPr>
+      <w:r>
+        <w:t xml:space="preserve">4. EXPLAIN i EXPLAIN ANALYZE</w:t>
+      </w:r>
+    </w:p>
+    <w:bookmarkEnd w:id="24"/>
+    <w:bookmarkStart w:id="25" w:name="iterator-model-i-pipeline-operatora"/>
+    <w:p>
+      <w:pPr>
+        <w:pStyle w:val="Heading1"/>
+      </w:pPr>
+      <w:r>
+        <w:t xml:space="preserve">5. Iterator model i pipeline operatora</w:t>
+      </w:r>
+    </w:p>
+    <w:bookmarkEnd w:id="25"/>
+    <w:bookmarkStart w:id="26" w:name="vektorizovano-izvršavanje"/>
+    <w:p>
+      <w:pPr>
+        <w:pStyle w:val="Heading1"/>
+      </w:pPr>
+      <w:r>
+        <w:t xml:space="preserve">6. Vektorizovano izvršavanje</w:t>
+      </w:r>
+    </w:p>
+    <w:bookmarkEnd w:id="26"/>
+    <w:bookmarkStart w:id="27" w:name="paralelno-izvršavanje-upita"/>
+    <w:p>
+      <w:pPr>
+        <w:pStyle w:val="Heading1"/>
+      </w:pPr>
+      <w:r>
+        <w:t xml:space="preserve">7. Paralelno izvršavanje upita</w:t>
+      </w:r>
+    </w:p>
+    <w:bookmarkEnd w:id="27"/>
+    <w:bookmarkStart w:id="28" w:name="keširanje-i-ponovna-upotreba-planova"/>
+    <w:p>
+      <w:pPr>
+        <w:pStyle w:val="Heading1"/>
+      </w:pPr>
+      <w:r>
+        <w:t xml:space="preserve">8. Keširanje i ponovna upotreba planova</w:t>
+      </w:r>
+    </w:p>
+    <w:bookmarkEnd w:id="28"/>
+    <w:bookmarkStart w:id="29" w:name="zaključak"/>
+    <w:p>
+      <w:pPr>
+        <w:pStyle w:val="Heading1"/>
+      </w:pPr>
+      <w:r>
+        <w:t xml:space="preserve">9. Zaključak</w:t>
+      </w:r>
+    </w:p>
+    <w:bookmarkEnd w:id="29"/>
+    <w:bookmarkStart w:id="36" w:name="reference"/>
+    <w:p>
+      <w:pPr>
+        <w:pStyle w:val="Heading1"/>
+      </w:pPr>
+      <w:r>
+        <w:t xml:space="preserve">Reference</w:t>
+      </w:r>
+    </w:p>
+    <w:bookmarkStart w:id="35" w:name="refs"/>
+    <w:bookmarkStart w:id="30" w:name="ref-ramakrishnan2003"/>
+    <w:p>
+      <w:pPr>
+        <w:pStyle w:val="Bibliography"/>
+      </w:pPr>
+      <w:r>
+        <w:t xml:space="preserve">[1]</w:t>
+      </w:r>
+      <w:r>
+        <w:t xml:space="preserve"> </w:t>
+      </w:r>
+      <w:r>
+        <w:t xml:space="preserve">	</w:t>
+      </w:r>
+      <w:r>
+        <w:t xml:space="preserve">R. Ramakrishnan and J. Gehrke,</w:t>
+      </w:r>
+      <w:r>
+        <w:t xml:space="preserve"> </w:t>
+      </w:r>
+      <w:r>
+        <w:rPr>
+          <w:i/>
+          <w:iCs/>
+        </w:rPr>
         <w:t xml:space="preserve">Database management systems</w:t>
       </w:r>
       <w:r>
         <w:t xml:space="preserve">, 3rd ed. New York, NY, USA: McGraw-Hill, 2003.</w:t>
       </w:r>
     </w:p>
-    <w:bookmarkEnd w:id="21"/>
-    <w:bookmarkStart w:id="23" w:name="ref-mysql84refman"/>
+    <w:bookmarkEnd w:id="30"/>
+    <w:bookmarkStart w:id="32" w:name="ref-mysql84refman"/>
     <w:p>
       <w:pPr>
         <w:pStyle w:val="Bibliography"/>
@@ -1046,7 +2260,7 @@
       <w:r>
         <w:t xml:space="preserve"> </w:t>
       </w:r>
-      <w:hyperlink r:id="rId22">
+      <w:hyperlink r:id="rId31">
         <w:r>
           <w:rPr>
             <w:rStyle w:val="Hyperlink"/>
@@ -1058,9 +2272,57 @@
         <w:t xml:space="preserve">, 2024.</w:t>
       </w:r>
     </w:p>
-    <w:bookmarkEnd w:id="23"/>
-    <w:bookmarkEnd w:id="24"/>
-    <w:bookmarkEnd w:id="25"/>
+    <w:bookmarkEnd w:id="32"/>
+    <w:bookmarkStart w:id="34" w:name="ref-mysqlsource84"/>
+    <w:p>
+      <w:pPr>
+        <w:pStyle w:val="Bibliography"/>
+      </w:pPr>
+      <w:r>
+        <w:t xml:space="preserve">[3]</w:t>
+      </w:r>
+      <w:r>
+        <w:t xml:space="preserve"> </w:t>
+      </w:r>
+      <w:r>
+        <w:t xml:space="preserve">	</w:t>
+      </w:r>
+      <w:r>
+        <w:t xml:space="preserve">Oracle Corporation,</w:t>
+      </w:r>
+      <w:r>
+        <w:t xml:space="preserve"> </w:t>
+      </w:r>
+      <w:r>
+        <w:t xml:space="preserve">“</w:t>
+      </w:r>
+      <w:r>
+        <w:t xml:space="preserve">MySQL</w:t>
+      </w:r>
+      <w:r>
+        <w:t xml:space="preserve"> </w:t>
+      </w:r>
+      <w:r>
+        <w:t xml:space="preserve">server source code, verzija 8.4.6.”</w:t>
+      </w:r>
+      <w:r>
+        <w:t xml:space="preserve"> </w:t>
+      </w:r>
+      <w:hyperlink r:id="rId33">
+        <w:r>
+          <w:rPr>
+            <w:rStyle w:val="Hyperlink"/>
+          </w:rPr>
+          <w:t xml:space="preserve">https://github.com/mysql/mysql-server/tree/mysql-8.4.6</w:t>
+        </w:r>
+      </w:hyperlink>
+      <w:r>
+        <w:t xml:space="preserve">, 2025.</w:t>
+      </w:r>
+    </w:p>
+    <w:bookmarkEnd w:id="34"/>
+    <w:bookmarkEnd w:id="35"/>
+    <w:bookmarkEnd w:id="36"/>
     <w:sectPr>
       <w:footnotePr>
         <w:numRestart w:val="eachSect"/>

</xml_diff>

<commit_message>
Shorten figure captions, move explanation to body text
Slika 1.1, 2.1-2.3 captions no longer duplicate the numbers and
step-by-step description that the following paragraph already gives;
captions now just identify the figure (and attribution, where it
applies).

Co-Authored-By: Claude Opus 4.8 <noreply@anthropic.com>
</commit_message>
<xml_diff>
--- a/Tema 1. - Obrada upita (query processing) u MySQL/rad.docx
+++ b/Tema 1. - Obrada upita (query processing) u MySQL/rad.docx
@@ -466,7 +466,7 @@
           <wp:inline>
             <wp:extent cx="5334000" cy="1804147"/>
             <wp:effectExtent b="0" l="0" r="0" t="0"/>
-            <wp:docPr descr="Slika 1.1: Jedan SQL upit, dva ekvivalentna plana izvršenja različite cene. Slobodan izbor optimizatora (A) koristi indeks idx_country_code (procenjena cena ≈ 499373), dok zabranjivanje tog indeksa (B) daje skuplji sken cele tabele (procenjena cena ≈ 575645); oba plana vraćaju isti rezultat od približno 3,5 miliona torki." title="" id="10" name="Picture"/>
+            <wp:docPr descr="Slika 1.1: Dva ekvivalentna plana izvršenja istog SQL upita, različite cene: sken preko indeksa (A) naspram skena cele tabele (B)." title="" id="10" name="Picture"/>
             <a:graphic>
               <a:graphicData uri="http://schemas.openxmlformats.org/drawingml/2006/picture">
                 <pic:pic>
@@ -509,40 +509,13 @@
         <w:pStyle w:val="ImageCaption"/>
       </w:pPr>
       <w:r>
-        <w:t xml:space="preserve">Slika 1.1: Jedan SQL upit, dva ekvivalentna plana izvršenja različite cene. Slobodan izbor</w:t>
-      </w:r>
-      <w:r>
-        <w:t xml:space="preserve"> </w:t>
-      </w:r>
-      <w:r>
-        <w:t xml:space="preserve">optimizatora (A) koristi indeks</w:t>
-      </w:r>
-      <w:r>
-        <w:t xml:space="preserve"> </w:t>
-      </w:r>
-      <w:r>
-        <w:rPr>
-          <w:rStyle w:val="VerbatimChar"/>
-        </w:rPr>
-        <w:t xml:space="preserve">idx_country_code</w:t>
-      </w:r>
-      <w:r>
-        <w:t xml:space="preserve"> </w:t>
-      </w:r>
-      <w:r>
-        <w:t xml:space="preserve">(procenjena cena ≈ 499373), dok zabranjivanje tog</w:t>
-      </w:r>
-      <w:r>
-        <w:t xml:space="preserve"> </w:t>
-      </w:r>
-      <w:r>
-        <w:t xml:space="preserve">indeksa (B) daje skuplji sken cele tabele (procenjena cena ≈ 575645); oba plana vraćaju isti rezultat</w:t>
-      </w:r>
-      <w:r>
-        <w:t xml:space="preserve"> </w:t>
-      </w:r>
-      <w:r>
-        <w:t xml:space="preserve">od približno 3,5 miliona torki.</w:t>
+        <w:t xml:space="preserve">Slika 1.1: Dva ekvivalentna plana izvršenja istog SQL upita, različite cene: sken preko indeksa (A)</w:t>
+      </w:r>
+      <w:r>
+        <w:t xml:space="preserve"> </w:t>
+      </w:r>
+      <w:r>
+        <w:t xml:space="preserve">naspram skena cele tabele (B).</w:t>
       </w:r>
     </w:p>
     <w:p>
@@ -1108,7 +1081,7 @@
           <wp:inline>
             <wp:extent cx="4762500" cy="5076825"/>
             <wp:effectExtent b="0" l="0" r="0" t="0"/>
-            <wp:docPr descr="Slika 2.1: Arhitektura MySQL-a sa modularnim mehanizmima skladištenja. Serverski sloj obuhvaćen je jedinstvenim procesom (SQL interfejs, parser, optimizator, kešovi i baferi), dok su motori (InnoDB, MyISAM, NDB Cluster, Memory) zasebni moduli ispod njega, povezani sa sistemom datoteka. Preuzeto iz priručnika [2], Figure 18.3." title="" id="14" name="Picture"/>
+            <wp:docPr descr="Slika 2.1: Arhitektura MySQL-a: serverski sloj i mehanizmi skladištenja. Preuzeto iz priručnika [2], Figure 18.3." title="" id="14" name="Picture"/>
             <a:graphic>
               <a:graphicData uri="http://schemas.openxmlformats.org/drawingml/2006/picture">
                 <pic:pic>
@@ -1151,25 +1124,7 @@
         <w:pStyle w:val="ImageCaption"/>
       </w:pPr>
       <w:r>
-        <w:t xml:space="preserve">Slika 2.1: Arhitektura MySQL-a sa modularnim mehanizmima skladištenja. Serverski sloj obuhvaćen je</w:t>
-      </w:r>
-      <w:r>
-        <w:t xml:space="preserve"> </w:t>
-      </w:r>
-      <w:r>
-        <w:t xml:space="preserve">jedinstvenim procesom (SQL interfejs, parser, optimizator, kešovi i baferi), dok su motori (InnoDB,</w:t>
-      </w:r>
-      <w:r>
-        <w:t xml:space="preserve"> </w:t>
-      </w:r>
-      <w:r>
-        <w:t xml:space="preserve">MyISAM, NDB Cluster, Memory) zasebni moduli ispod njega, povezani sa sistemom datoteka. Preuzeto iz</w:t>
-      </w:r>
-      <w:r>
-        <w:t xml:space="preserve"> </w:t>
-      </w:r>
-      <w:r>
-        <w:t xml:space="preserve">priručnika</w:t>
+        <w:t xml:space="preserve">Slika 2.1: Arhitektura MySQL-a: serverski sloj i mehanizmi skladištenja. Preuzeto iz priručnika</w:t>
       </w:r>
       <w:r>
         <w:t xml:space="preserve"> </w:t>
@@ -1650,7 +1605,7 @@
           <wp:inline>
             <wp:extent cx="5334000" cy="1241636"/>
             <wp:effectExtent b="0" l="0" r="0" t="0"/>
-            <wp:docPr descr="Slika 2.2: Plan upita sa uključenim spuštanjem uslova u indeks (ICP): jedan čvor, sken opsega preko indeksa idx_customer_created, sa uslovom označenim kao with index condition unutar samog skena. Plameni grafikon dobijen iz EXPLAIN ANALYZE FORMAT=JSON, izmereno na živom serveru (MySQL 8.4.11)." title="" id="17" name="Picture"/>
+            <wp:docPr descr="Slika 2.2: Plan upita sa uključenim spuštanjem uslova u indeks (ICP). Plameni grafikon iz EXPLAIN ANALYZE FORMAT=JSON, izmereno na živom serveru (MySQL 8.4.11)." title="" id="17" name="Picture"/>
             <a:graphic>
               <a:graphicData uri="http://schemas.openxmlformats.org/drawingml/2006/picture">
                 <pic:pic>
@@ -1693,46 +1648,7 @@
         <w:pStyle w:val="ImageCaption"/>
       </w:pPr>
       <w:r>
-        <w:t xml:space="preserve">Slika 2.2: Plan upita sa uključenim spuštanjem uslova u indeks (ICP): jedan čvor, sken opsega preko</w:t>
-      </w:r>
-      <w:r>
-        <w:t xml:space="preserve"> </w:t>
-      </w:r>
-      <w:r>
-        <w:t xml:space="preserve">indeksa</w:t>
-      </w:r>
-      <w:r>
-        <w:t xml:space="preserve"> </w:t>
-      </w:r>
-      <w:r>
-        <w:rPr>
-          <w:rStyle w:val="VerbatimChar"/>
-        </w:rPr>
-        <w:t xml:space="preserve">idx_customer_created</w:t>
-      </w:r>
-      <w:r>
-        <w:t xml:space="preserve">, sa uslovom označenim kao</w:t>
-      </w:r>
-      <w:r>
-        <w:t xml:space="preserve"> </w:t>
-      </w:r>
-      <w:r>
-        <w:rPr>
-          <w:rStyle w:val="VerbatimChar"/>
-        </w:rPr>
-        <w:t xml:space="preserve">with index condition</w:t>
-      </w:r>
-      <w:r>
-        <w:t xml:space="preserve"> </w:t>
-      </w:r>
-      <w:r>
-        <w:t xml:space="preserve">unutar samog skena.</w:t>
-      </w:r>
-      <w:r>
-        <w:t xml:space="preserve"> </w:t>
-      </w:r>
-      <w:r>
-        <w:t xml:space="preserve">Plameni grafikon dobijen iz</w:t>
+        <w:t xml:space="preserve">Slika 2.2: Plan upita sa uključenim spuštanjem uslova u indeks (ICP). Plameni grafikon iz</w:t>
       </w:r>
       <w:r>
         <w:t xml:space="preserve"> </w:t>
@@ -1762,7 +1678,7 @@
           <wp:inline>
             <wp:extent cx="5334000" cy="1336463"/>
             <wp:effectExtent b="0" l="0" r="0" t="0"/>
-            <wp:docPr descr="Slika 2.3: Isti upit sa isključenim spuštanjem uslova: iznad skena se pojavljuje zaseban čvor Filter, koji obavlja serverski sloj. Sken propušta 499.297 torki, a filter zadržava 165.707; razlika od 333.590 torki prelazi granicu samo da bi bila odbačena." title="" id="20" name="Picture"/>
+            <wp:docPr descr="Slika 2.3: Isti upit sa isključenim spuštanjem uslova, sa zasebnim čvorom Filter u planu." title="" id="20" name="Picture"/>
             <a:graphic>
               <a:graphicData uri="http://schemas.openxmlformats.org/drawingml/2006/picture">
                 <pic:pic>
@@ -1805,7 +1721,7 @@
         <w:pStyle w:val="ImageCaption"/>
       </w:pPr>
       <w:r>
-        <w:t xml:space="preserve">Slika 2.3: Isti upit sa isključenim spuštanjem uslova: iznad skena se pojavljuje zaseban čvor</w:t>
+        <w:t xml:space="preserve">Slika 2.3: Isti upit sa isključenim spuštanjem uslova, sa zasebnim čvorom</w:t>
       </w:r>
       <w:r>
         <w:t xml:space="preserve"> </w:t>
@@ -1817,13 +1733,16 @@
         <w:t xml:space="preserve">Filter</w:t>
       </w:r>
       <w:r>
-        <w:t xml:space="preserve">, koji obavlja serverski sloj. Sken propušta 499.297 torki, a filter zadržava 165.707;</w:t>
-      </w:r>
-      <w:r>
-        <w:t xml:space="preserve"> </w:t>
-      </w:r>
-      <w:r>
-        <w:t xml:space="preserve">razlika od 333.590 torki prelazi granicu samo da bi bila odbačena.</w:t>
+        <w:t xml:space="preserve"> </w:t>
+      </w:r>
+      <w:r>
+        <w:t xml:space="preserve">u</w:t>
+      </w:r>
+      <w:r>
+        <w:t xml:space="preserve"> </w:t>
+      </w:r>
+      <w:r>
+        <w:t xml:space="preserve">planu.</w:t>
       </w:r>
     </w:p>
     <w:p>

</xml_diff>

<commit_message>
Clarify chapter 3: "SQL niske" -> "SQL naredbu kao niz znakova"
Replace the textbook term "niska" (string) with the plainer "niz znakova"
(sequence of characters) in the parser sentence; same meaning, reads clearer.
Rebuild rad.docx.

Co-Authored-By: Claude Sonnet 5 <noreply@anthropic.com>
</commit_message>
<xml_diff>
--- a/Tema 1. - Obrada upita (query processing) u MySQL/rad.docx
+++ b/Tema 1. - Obrada upita (query processing) u MySQL/rad.docx
@@ -2470,13 +2470,13 @@
         <w:pStyle w:val="FirstParagraph"/>
       </w:pPr>
       <w:r>
-        <w:t xml:space="preserve">Prva faza gleda samo tekst naredbe. Priručnik je o tome sažet: parser obrađuje SQL niske i gradi</w:t>
-      </w:r>
-      <w:r>
-        <w:t xml:space="preserve"> </w:t>
-      </w:r>
-      <w:r>
-        <w:t xml:space="preserve">njihov prikaz u obliku stabla, bez ikakve provere da tabela ili kolona postoji</w:t>
+        <w:t xml:space="preserve">Prva faza gleda samo tekst naredbe. Priručnik je o tome sažet: parser obrađuje SQL naredbu kao niz</w:t>
+      </w:r>
+      <w:r>
+        <w:t xml:space="preserve"> </w:t>
+      </w:r>
+      <w:r>
+        <w:t xml:space="preserve">znakova i gradi njen prikaz u obliku stabla, bez ikakve provere da tabela ili kolona postoji</w:t>
       </w:r>
       <w:r>
         <w:t xml:space="preserve"> </w:t>

</xml_diff>